<commit_message>
Documentacion UML, casos de uso. Todas las EPICAS
</commit_message>
<xml_diff>
--- a/Uml/Documentación/UML_CowPay_v2.docx
+++ b/Uml/Documentación/UML_CowPay_v2.docx
@@ -2370,7 +2370,25 @@
                 <w:sz w:val="24"/>
                 <w:szCs w:val="24"/>
               </w:rPr>
-              <w:t>9. Épica 7 — Cocina en Tiempo Real</w:t>
+              <w:t>9. Épica 7 — C</w:t>
+            </w:r>
+            <w:r>
+              <w:rPr>
+                <w:rStyle w:val="Hipervnculo"/>
+                <w:noProof/>
+                <w:sz w:val="24"/>
+                <w:szCs w:val="24"/>
+              </w:rPr>
+              <w:t>o</w:t>
+            </w:r>
+            <w:r>
+              <w:rPr>
+                <w:rStyle w:val="Hipervnculo"/>
+                <w:noProof/>
+                <w:sz w:val="24"/>
+                <w:szCs w:val="24"/>
+              </w:rPr>
+              <w:t>cina en Tiempo Real</w:t>
             </w:r>
             <w:r>
               <w:rPr>
@@ -2765,25 +2783,7 @@
                 <w:sz w:val="24"/>
                 <w:szCs w:val="24"/>
               </w:rPr>
-              <w:t>10.2 Tablas desc</w:t>
-            </w:r>
-            <w:r>
-              <w:rPr>
-                <w:rStyle w:val="Hipervnculo"/>
-                <w:noProof/>
-                <w:sz w:val="24"/>
-                <w:szCs w:val="24"/>
-              </w:rPr>
-              <w:t>r</w:t>
-            </w:r>
-            <w:r>
-              <w:rPr>
-                <w:rStyle w:val="Hipervnculo"/>
-                <w:noProof/>
-                <w:sz w:val="24"/>
-                <w:szCs w:val="24"/>
-              </w:rPr>
-              <w:t>iptivas (casos de uso azules)</w:t>
+              <w:t>10.2 Tablas descriptivas (casos de uso azules)</w:t>
             </w:r>
             <w:r>
               <w:rPr>
@@ -3757,12 +3757,6 @@
         <w:gridCol w:w="3278"/>
       </w:tblGrid>
       <w:tr>
-        <w:tblPrEx>
-          <w:tblCellMar>
-            <w:top w:w="0" w:type="dxa"/>
-            <w:bottom w:w="0" w:type="dxa"/>
-          </w:tblCellMar>
-        </w:tblPrEx>
         <w:tc>
           <w:tcPr>
             <w:tcW w:w="3180" w:type="dxa"/>
@@ -3873,12 +3867,6 @@
         </w:tc>
       </w:tr>
       <w:tr>
-        <w:tblPrEx>
-          <w:tblCellMar>
-            <w:top w:w="0" w:type="dxa"/>
-            <w:bottom w:w="0" w:type="dxa"/>
-          </w:tblCellMar>
-        </w:tblPrEx>
         <w:tc>
           <w:tcPr>
             <w:tcW w:w="3180" w:type="dxa"/>
@@ -3982,12 +3970,6 @@
         </w:tc>
       </w:tr>
       <w:tr>
-        <w:tblPrEx>
-          <w:tblCellMar>
-            <w:top w:w="0" w:type="dxa"/>
-            <w:bottom w:w="0" w:type="dxa"/>
-          </w:tblCellMar>
-        </w:tblPrEx>
         <w:tc>
           <w:tcPr>
             <w:tcW w:w="3180" w:type="dxa"/>
@@ -4091,12 +4073,6 @@
         </w:tc>
       </w:tr>
       <w:tr>
-        <w:tblPrEx>
-          <w:tblCellMar>
-            <w:top w:w="0" w:type="dxa"/>
-            <w:bottom w:w="0" w:type="dxa"/>
-          </w:tblCellMar>
-        </w:tblPrEx>
         <w:tc>
           <w:tcPr>
             <w:tcW w:w="3180" w:type="dxa"/>
@@ -4330,12 +4306,6 @@
         <w:gridCol w:w="5301"/>
       </w:tblGrid>
       <w:tr>
-        <w:tblPrEx>
-          <w:tblCellMar>
-            <w:top w:w="0" w:type="dxa"/>
-            <w:bottom w:w="0" w:type="dxa"/>
-          </w:tblCellMar>
-        </w:tblPrEx>
         <w:tc>
           <w:tcPr>
             <w:tcW w:w="4337" w:type="dxa"/>
@@ -4410,12 +4380,6 @@
         </w:tc>
       </w:tr>
       <w:tr>
-        <w:tblPrEx>
-          <w:tblCellMar>
-            <w:top w:w="0" w:type="dxa"/>
-            <w:bottom w:w="0" w:type="dxa"/>
-          </w:tblCellMar>
-        </w:tblPrEx>
         <w:tc>
           <w:tcPr>
             <w:tcW w:w="4337" w:type="dxa"/>
@@ -4486,12 +4450,6 @@
         </w:tc>
       </w:tr>
       <w:tr>
-        <w:tblPrEx>
-          <w:tblCellMar>
-            <w:top w:w="0" w:type="dxa"/>
-            <w:bottom w:w="0" w:type="dxa"/>
-          </w:tblCellMar>
-        </w:tblPrEx>
         <w:tc>
           <w:tcPr>
             <w:tcW w:w="4337" w:type="dxa"/>
@@ -4562,12 +4520,6 @@
         </w:tc>
       </w:tr>
       <w:tr>
-        <w:tblPrEx>
-          <w:tblCellMar>
-            <w:top w:w="0" w:type="dxa"/>
-            <w:bottom w:w="0" w:type="dxa"/>
-          </w:tblCellMar>
-        </w:tblPrEx>
         <w:tc>
           <w:tcPr>
             <w:tcW w:w="4337" w:type="dxa"/>
@@ -4638,12 +4590,6 @@
         </w:tc>
       </w:tr>
       <w:tr>
-        <w:tblPrEx>
-          <w:tblCellMar>
-            <w:top w:w="0" w:type="dxa"/>
-            <w:bottom w:w="0" w:type="dxa"/>
-          </w:tblCellMar>
-        </w:tblPrEx>
         <w:tc>
           <w:tcPr>
             <w:tcW w:w="4337" w:type="dxa"/>
@@ -4714,12 +4660,6 @@
         </w:tc>
       </w:tr>
       <w:tr>
-        <w:tblPrEx>
-          <w:tblCellMar>
-            <w:top w:w="0" w:type="dxa"/>
-            <w:bottom w:w="0" w:type="dxa"/>
-          </w:tblCellMar>
-        </w:tblPrEx>
         <w:tc>
           <w:tcPr>
             <w:tcW w:w="4337" w:type="dxa"/>
@@ -5018,12 +4958,6 @@
         <w:gridCol w:w="6747"/>
       </w:tblGrid>
       <w:tr>
-        <w:tblPrEx>
-          <w:tblCellMar>
-            <w:top w:w="0" w:type="dxa"/>
-            <w:bottom w:w="0" w:type="dxa"/>
-          </w:tblCellMar>
-        </w:tblPrEx>
         <w:tc>
           <w:tcPr>
             <w:tcW w:w="9638" w:type="dxa"/>
@@ -5063,12 +4997,6 @@
         </w:tc>
       </w:tr>
       <w:tr>
-        <w:tblPrEx>
-          <w:tblCellMar>
-            <w:top w:w="0" w:type="dxa"/>
-            <w:bottom w:w="0" w:type="dxa"/>
-          </w:tblCellMar>
-        </w:tblPrEx>
         <w:tc>
           <w:tcPr>
             <w:tcW w:w="2891" w:type="dxa"/>
@@ -5139,12 +5067,6 @@
         </w:tc>
       </w:tr>
       <w:tr>
-        <w:tblPrEx>
-          <w:tblCellMar>
-            <w:top w:w="0" w:type="dxa"/>
-            <w:bottom w:w="0" w:type="dxa"/>
-          </w:tblCellMar>
-        </w:tblPrEx>
         <w:tc>
           <w:tcPr>
             <w:tcW w:w="2891" w:type="dxa"/>
@@ -5215,12 +5137,6 @@
         </w:tc>
       </w:tr>
       <w:tr>
-        <w:tblPrEx>
-          <w:tblCellMar>
-            <w:top w:w="0" w:type="dxa"/>
-            <w:bottom w:w="0" w:type="dxa"/>
-          </w:tblCellMar>
-        </w:tblPrEx>
         <w:tc>
           <w:tcPr>
             <w:tcW w:w="2891" w:type="dxa"/>
@@ -5291,12 +5207,6 @@
         </w:tc>
       </w:tr>
       <w:tr>
-        <w:tblPrEx>
-          <w:tblCellMar>
-            <w:top w:w="0" w:type="dxa"/>
-            <w:bottom w:w="0" w:type="dxa"/>
-          </w:tblCellMar>
-        </w:tblPrEx>
         <w:tc>
           <w:tcPr>
             <w:tcW w:w="2891" w:type="dxa"/>
@@ -5367,12 +5277,6 @@
         </w:tc>
       </w:tr>
       <w:tr>
-        <w:tblPrEx>
-          <w:tblCellMar>
-            <w:top w:w="0" w:type="dxa"/>
-            <w:bottom w:w="0" w:type="dxa"/>
-          </w:tblCellMar>
-        </w:tblPrEx>
         <w:tc>
           <w:tcPr>
             <w:tcW w:w="2891" w:type="dxa"/>
@@ -5443,12 +5347,6 @@
         </w:tc>
       </w:tr>
       <w:tr>
-        <w:tblPrEx>
-          <w:tblCellMar>
-            <w:top w:w="0" w:type="dxa"/>
-            <w:bottom w:w="0" w:type="dxa"/>
-          </w:tblCellMar>
-        </w:tblPrEx>
         <w:tc>
           <w:tcPr>
             <w:tcW w:w="2891" w:type="dxa"/>
@@ -5527,12 +5425,6 @@
         </w:tc>
       </w:tr>
       <w:tr>
-        <w:tblPrEx>
-          <w:tblCellMar>
-            <w:top w:w="0" w:type="dxa"/>
-            <w:bottom w:w="0" w:type="dxa"/>
-          </w:tblCellMar>
-        </w:tblPrEx>
         <w:tc>
           <w:tcPr>
             <w:tcW w:w="2891" w:type="dxa"/>
@@ -5604,12 +5496,6 @@
         </w:tc>
       </w:tr>
       <w:tr>
-        <w:tblPrEx>
-          <w:tblCellMar>
-            <w:top w:w="0" w:type="dxa"/>
-            <w:bottom w:w="0" w:type="dxa"/>
-          </w:tblCellMar>
-        </w:tblPrEx>
         <w:tc>
           <w:tcPr>
             <w:tcW w:w="2891" w:type="dxa"/>
@@ -5680,12 +5566,6 @@
         </w:tc>
       </w:tr>
       <w:tr>
-        <w:tblPrEx>
-          <w:tblCellMar>
-            <w:top w:w="0" w:type="dxa"/>
-            <w:bottom w:w="0" w:type="dxa"/>
-          </w:tblCellMar>
-        </w:tblPrEx>
         <w:tc>
           <w:tcPr>
             <w:tcW w:w="2891" w:type="dxa"/>
@@ -5756,12 +5636,6 @@
         </w:tc>
       </w:tr>
       <w:tr>
-        <w:tblPrEx>
-          <w:tblCellMar>
-            <w:top w:w="0" w:type="dxa"/>
-            <w:bottom w:w="0" w:type="dxa"/>
-          </w:tblCellMar>
-        </w:tblPrEx>
         <w:tc>
           <w:tcPr>
             <w:tcW w:w="2891" w:type="dxa"/>
@@ -5832,12 +5706,6 @@
         </w:tc>
       </w:tr>
       <w:tr>
-        <w:tblPrEx>
-          <w:tblCellMar>
-            <w:top w:w="0" w:type="dxa"/>
-            <w:bottom w:w="0" w:type="dxa"/>
-          </w:tblCellMar>
-        </w:tblPrEx>
         <w:tc>
           <w:tcPr>
             <w:tcW w:w="2891" w:type="dxa"/>
@@ -5958,12 +5826,6 @@
         <w:gridCol w:w="6747"/>
       </w:tblGrid>
       <w:tr>
-        <w:tblPrEx>
-          <w:tblCellMar>
-            <w:top w:w="0" w:type="dxa"/>
-            <w:bottom w:w="0" w:type="dxa"/>
-          </w:tblCellMar>
-        </w:tblPrEx>
         <w:tc>
           <w:tcPr>
             <w:tcW w:w="9638" w:type="dxa"/>
@@ -6003,12 +5865,6 @@
         </w:tc>
       </w:tr>
       <w:tr>
-        <w:tblPrEx>
-          <w:tblCellMar>
-            <w:top w:w="0" w:type="dxa"/>
-            <w:bottom w:w="0" w:type="dxa"/>
-          </w:tblCellMar>
-        </w:tblPrEx>
         <w:tc>
           <w:tcPr>
             <w:tcW w:w="2891" w:type="dxa"/>
@@ -6079,12 +5935,6 @@
         </w:tc>
       </w:tr>
       <w:tr>
-        <w:tblPrEx>
-          <w:tblCellMar>
-            <w:top w:w="0" w:type="dxa"/>
-            <w:bottom w:w="0" w:type="dxa"/>
-          </w:tblCellMar>
-        </w:tblPrEx>
         <w:tc>
           <w:tcPr>
             <w:tcW w:w="2891" w:type="dxa"/>
@@ -6155,12 +6005,6 @@
         </w:tc>
       </w:tr>
       <w:tr>
-        <w:tblPrEx>
-          <w:tblCellMar>
-            <w:top w:w="0" w:type="dxa"/>
-            <w:bottom w:w="0" w:type="dxa"/>
-          </w:tblCellMar>
-        </w:tblPrEx>
         <w:tc>
           <w:tcPr>
             <w:tcW w:w="2891" w:type="dxa"/>
@@ -6231,12 +6075,6 @@
         </w:tc>
       </w:tr>
       <w:tr>
-        <w:tblPrEx>
-          <w:tblCellMar>
-            <w:top w:w="0" w:type="dxa"/>
-            <w:bottom w:w="0" w:type="dxa"/>
-          </w:tblCellMar>
-        </w:tblPrEx>
         <w:tc>
           <w:tcPr>
             <w:tcW w:w="2891" w:type="dxa"/>
@@ -6307,12 +6145,6 @@
         </w:tc>
       </w:tr>
       <w:tr>
-        <w:tblPrEx>
-          <w:tblCellMar>
-            <w:top w:w="0" w:type="dxa"/>
-            <w:bottom w:w="0" w:type="dxa"/>
-          </w:tblCellMar>
-        </w:tblPrEx>
         <w:tc>
           <w:tcPr>
             <w:tcW w:w="2891" w:type="dxa"/>
@@ -6383,12 +6215,6 @@
         </w:tc>
       </w:tr>
       <w:tr>
-        <w:tblPrEx>
-          <w:tblCellMar>
-            <w:top w:w="0" w:type="dxa"/>
-            <w:bottom w:w="0" w:type="dxa"/>
-          </w:tblCellMar>
-        </w:tblPrEx>
         <w:tc>
           <w:tcPr>
             <w:tcW w:w="2891" w:type="dxa"/>
@@ -6459,12 +6285,6 @@
         </w:tc>
       </w:tr>
       <w:tr>
-        <w:tblPrEx>
-          <w:tblCellMar>
-            <w:top w:w="0" w:type="dxa"/>
-            <w:bottom w:w="0" w:type="dxa"/>
-          </w:tblCellMar>
-        </w:tblPrEx>
         <w:tc>
           <w:tcPr>
             <w:tcW w:w="2891" w:type="dxa"/>
@@ -6535,12 +6355,6 @@
         </w:tc>
       </w:tr>
       <w:tr>
-        <w:tblPrEx>
-          <w:tblCellMar>
-            <w:top w:w="0" w:type="dxa"/>
-            <w:bottom w:w="0" w:type="dxa"/>
-          </w:tblCellMar>
-        </w:tblPrEx>
         <w:tc>
           <w:tcPr>
             <w:tcW w:w="2891" w:type="dxa"/>
@@ -6611,12 +6425,6 @@
         </w:tc>
       </w:tr>
       <w:tr>
-        <w:tblPrEx>
-          <w:tblCellMar>
-            <w:top w:w="0" w:type="dxa"/>
-            <w:bottom w:w="0" w:type="dxa"/>
-          </w:tblCellMar>
-        </w:tblPrEx>
         <w:tc>
           <w:tcPr>
             <w:tcW w:w="2891" w:type="dxa"/>
@@ -6687,12 +6495,6 @@
         </w:tc>
       </w:tr>
       <w:tr>
-        <w:tblPrEx>
-          <w:tblCellMar>
-            <w:top w:w="0" w:type="dxa"/>
-            <w:bottom w:w="0" w:type="dxa"/>
-          </w:tblCellMar>
-        </w:tblPrEx>
         <w:tc>
           <w:tcPr>
             <w:tcW w:w="2891" w:type="dxa"/>
@@ -6763,12 +6565,6 @@
         </w:tc>
       </w:tr>
       <w:tr>
-        <w:tblPrEx>
-          <w:tblCellMar>
-            <w:top w:w="0" w:type="dxa"/>
-            <w:bottom w:w="0" w:type="dxa"/>
-          </w:tblCellMar>
-        </w:tblPrEx>
         <w:tc>
           <w:tcPr>
             <w:tcW w:w="2891" w:type="dxa"/>
@@ -6889,12 +6685,6 @@
         <w:gridCol w:w="6747"/>
       </w:tblGrid>
       <w:tr>
-        <w:tblPrEx>
-          <w:tblCellMar>
-            <w:top w:w="0" w:type="dxa"/>
-            <w:bottom w:w="0" w:type="dxa"/>
-          </w:tblCellMar>
-        </w:tblPrEx>
         <w:tc>
           <w:tcPr>
             <w:tcW w:w="9638" w:type="dxa"/>
@@ -6934,12 +6724,6 @@
         </w:tc>
       </w:tr>
       <w:tr>
-        <w:tblPrEx>
-          <w:tblCellMar>
-            <w:top w:w="0" w:type="dxa"/>
-            <w:bottom w:w="0" w:type="dxa"/>
-          </w:tblCellMar>
-        </w:tblPrEx>
         <w:tc>
           <w:tcPr>
             <w:tcW w:w="2891" w:type="dxa"/>
@@ -7010,12 +6794,6 @@
         </w:tc>
       </w:tr>
       <w:tr>
-        <w:tblPrEx>
-          <w:tblCellMar>
-            <w:top w:w="0" w:type="dxa"/>
-            <w:bottom w:w="0" w:type="dxa"/>
-          </w:tblCellMar>
-        </w:tblPrEx>
         <w:tc>
           <w:tcPr>
             <w:tcW w:w="2891" w:type="dxa"/>
@@ -7087,12 +6865,6 @@
         </w:tc>
       </w:tr>
       <w:tr>
-        <w:tblPrEx>
-          <w:tblCellMar>
-            <w:top w:w="0" w:type="dxa"/>
-            <w:bottom w:w="0" w:type="dxa"/>
-          </w:tblCellMar>
-        </w:tblPrEx>
         <w:tc>
           <w:tcPr>
             <w:tcW w:w="2891" w:type="dxa"/>
@@ -7163,12 +6935,6 @@
         </w:tc>
       </w:tr>
       <w:tr>
-        <w:tblPrEx>
-          <w:tblCellMar>
-            <w:top w:w="0" w:type="dxa"/>
-            <w:bottom w:w="0" w:type="dxa"/>
-          </w:tblCellMar>
-        </w:tblPrEx>
         <w:tc>
           <w:tcPr>
             <w:tcW w:w="2891" w:type="dxa"/>
@@ -7239,12 +7005,6 @@
         </w:tc>
       </w:tr>
       <w:tr>
-        <w:tblPrEx>
-          <w:tblCellMar>
-            <w:top w:w="0" w:type="dxa"/>
-            <w:bottom w:w="0" w:type="dxa"/>
-          </w:tblCellMar>
-        </w:tblPrEx>
         <w:tc>
           <w:tcPr>
             <w:tcW w:w="2891" w:type="dxa"/>
@@ -7315,12 +7075,6 @@
         </w:tc>
       </w:tr>
       <w:tr>
-        <w:tblPrEx>
-          <w:tblCellMar>
-            <w:top w:w="0" w:type="dxa"/>
-            <w:bottom w:w="0" w:type="dxa"/>
-          </w:tblCellMar>
-        </w:tblPrEx>
         <w:tc>
           <w:tcPr>
             <w:tcW w:w="2891" w:type="dxa"/>
@@ -7391,12 +7145,6 @@
         </w:tc>
       </w:tr>
       <w:tr>
-        <w:tblPrEx>
-          <w:tblCellMar>
-            <w:top w:w="0" w:type="dxa"/>
-            <w:bottom w:w="0" w:type="dxa"/>
-          </w:tblCellMar>
-        </w:tblPrEx>
         <w:tc>
           <w:tcPr>
             <w:tcW w:w="2891" w:type="dxa"/>
@@ -7467,12 +7215,6 @@
         </w:tc>
       </w:tr>
       <w:tr>
-        <w:tblPrEx>
-          <w:tblCellMar>
-            <w:top w:w="0" w:type="dxa"/>
-            <w:bottom w:w="0" w:type="dxa"/>
-          </w:tblCellMar>
-        </w:tblPrEx>
         <w:tc>
           <w:tcPr>
             <w:tcW w:w="2891" w:type="dxa"/>
@@ -7543,12 +7285,6 @@
         </w:tc>
       </w:tr>
       <w:tr>
-        <w:tblPrEx>
-          <w:tblCellMar>
-            <w:top w:w="0" w:type="dxa"/>
-            <w:bottom w:w="0" w:type="dxa"/>
-          </w:tblCellMar>
-        </w:tblPrEx>
         <w:tc>
           <w:tcPr>
             <w:tcW w:w="2891" w:type="dxa"/>
@@ -7619,12 +7355,6 @@
         </w:tc>
       </w:tr>
       <w:tr>
-        <w:tblPrEx>
-          <w:tblCellMar>
-            <w:top w:w="0" w:type="dxa"/>
-            <w:bottom w:w="0" w:type="dxa"/>
-          </w:tblCellMar>
-        </w:tblPrEx>
         <w:tc>
           <w:tcPr>
             <w:tcW w:w="2891" w:type="dxa"/>
@@ -7695,12 +7425,6 @@
         </w:tc>
       </w:tr>
       <w:tr>
-        <w:tblPrEx>
-          <w:tblCellMar>
-            <w:top w:w="0" w:type="dxa"/>
-            <w:bottom w:w="0" w:type="dxa"/>
-          </w:tblCellMar>
-        </w:tblPrEx>
         <w:tc>
           <w:tcPr>
             <w:tcW w:w="2891" w:type="dxa"/>
@@ -7821,12 +7545,6 @@
         <w:gridCol w:w="6747"/>
       </w:tblGrid>
       <w:tr>
-        <w:tblPrEx>
-          <w:tblCellMar>
-            <w:top w:w="0" w:type="dxa"/>
-            <w:bottom w:w="0" w:type="dxa"/>
-          </w:tblCellMar>
-        </w:tblPrEx>
         <w:tc>
           <w:tcPr>
             <w:tcW w:w="9638" w:type="dxa"/>
@@ -7866,12 +7584,6 @@
         </w:tc>
       </w:tr>
       <w:tr>
-        <w:tblPrEx>
-          <w:tblCellMar>
-            <w:top w:w="0" w:type="dxa"/>
-            <w:bottom w:w="0" w:type="dxa"/>
-          </w:tblCellMar>
-        </w:tblPrEx>
         <w:tc>
           <w:tcPr>
             <w:tcW w:w="2891" w:type="dxa"/>
@@ -7942,12 +7654,6 @@
         </w:tc>
       </w:tr>
       <w:tr>
-        <w:tblPrEx>
-          <w:tblCellMar>
-            <w:top w:w="0" w:type="dxa"/>
-            <w:bottom w:w="0" w:type="dxa"/>
-          </w:tblCellMar>
-        </w:tblPrEx>
         <w:tc>
           <w:tcPr>
             <w:tcW w:w="2891" w:type="dxa"/>
@@ -8018,12 +7724,6 @@
         </w:tc>
       </w:tr>
       <w:tr>
-        <w:tblPrEx>
-          <w:tblCellMar>
-            <w:top w:w="0" w:type="dxa"/>
-            <w:bottom w:w="0" w:type="dxa"/>
-          </w:tblCellMar>
-        </w:tblPrEx>
         <w:tc>
           <w:tcPr>
             <w:tcW w:w="2891" w:type="dxa"/>
@@ -8094,12 +7794,6 @@
         </w:tc>
       </w:tr>
       <w:tr>
-        <w:tblPrEx>
-          <w:tblCellMar>
-            <w:top w:w="0" w:type="dxa"/>
-            <w:bottom w:w="0" w:type="dxa"/>
-          </w:tblCellMar>
-        </w:tblPrEx>
         <w:tc>
           <w:tcPr>
             <w:tcW w:w="2891" w:type="dxa"/>
@@ -8170,12 +7864,6 @@
         </w:tc>
       </w:tr>
       <w:tr>
-        <w:tblPrEx>
-          <w:tblCellMar>
-            <w:top w:w="0" w:type="dxa"/>
-            <w:bottom w:w="0" w:type="dxa"/>
-          </w:tblCellMar>
-        </w:tblPrEx>
         <w:tc>
           <w:tcPr>
             <w:tcW w:w="2891" w:type="dxa"/>
@@ -8246,12 +7934,6 @@
         </w:tc>
       </w:tr>
       <w:tr>
-        <w:tblPrEx>
-          <w:tblCellMar>
-            <w:top w:w="0" w:type="dxa"/>
-            <w:bottom w:w="0" w:type="dxa"/>
-          </w:tblCellMar>
-        </w:tblPrEx>
         <w:tc>
           <w:tcPr>
             <w:tcW w:w="2891" w:type="dxa"/>
@@ -8322,12 +8004,6 @@
         </w:tc>
       </w:tr>
       <w:tr>
-        <w:tblPrEx>
-          <w:tblCellMar>
-            <w:top w:w="0" w:type="dxa"/>
-            <w:bottom w:w="0" w:type="dxa"/>
-          </w:tblCellMar>
-        </w:tblPrEx>
         <w:tc>
           <w:tcPr>
             <w:tcW w:w="2891" w:type="dxa"/>
@@ -8398,12 +8074,6 @@
         </w:tc>
       </w:tr>
       <w:tr>
-        <w:tblPrEx>
-          <w:tblCellMar>
-            <w:top w:w="0" w:type="dxa"/>
-            <w:bottom w:w="0" w:type="dxa"/>
-          </w:tblCellMar>
-        </w:tblPrEx>
         <w:tc>
           <w:tcPr>
             <w:tcW w:w="2891" w:type="dxa"/>
@@ -8475,12 +8145,6 @@
         </w:tc>
       </w:tr>
       <w:tr>
-        <w:tblPrEx>
-          <w:tblCellMar>
-            <w:top w:w="0" w:type="dxa"/>
-            <w:bottom w:w="0" w:type="dxa"/>
-          </w:tblCellMar>
-        </w:tblPrEx>
         <w:tc>
           <w:tcPr>
             <w:tcW w:w="2891" w:type="dxa"/>
@@ -8551,12 +8215,6 @@
         </w:tc>
       </w:tr>
       <w:tr>
-        <w:tblPrEx>
-          <w:tblCellMar>
-            <w:top w:w="0" w:type="dxa"/>
-            <w:bottom w:w="0" w:type="dxa"/>
-          </w:tblCellMar>
-        </w:tblPrEx>
         <w:tc>
           <w:tcPr>
             <w:tcW w:w="2891" w:type="dxa"/>
@@ -8627,12 +8285,6 @@
         </w:tc>
       </w:tr>
       <w:tr>
-        <w:tblPrEx>
-          <w:tblCellMar>
-            <w:top w:w="0" w:type="dxa"/>
-            <w:bottom w:w="0" w:type="dxa"/>
-          </w:tblCellMar>
-        </w:tblPrEx>
         <w:tc>
           <w:tcPr>
             <w:tcW w:w="2891" w:type="dxa"/>
@@ -8753,12 +8405,6 @@
         <w:gridCol w:w="6747"/>
       </w:tblGrid>
       <w:tr>
-        <w:tblPrEx>
-          <w:tblCellMar>
-            <w:top w:w="0" w:type="dxa"/>
-            <w:bottom w:w="0" w:type="dxa"/>
-          </w:tblCellMar>
-        </w:tblPrEx>
         <w:tc>
           <w:tcPr>
             <w:tcW w:w="9638" w:type="dxa"/>
@@ -8798,12 +8444,6 @@
         </w:tc>
       </w:tr>
       <w:tr>
-        <w:tblPrEx>
-          <w:tblCellMar>
-            <w:top w:w="0" w:type="dxa"/>
-            <w:bottom w:w="0" w:type="dxa"/>
-          </w:tblCellMar>
-        </w:tblPrEx>
         <w:tc>
           <w:tcPr>
             <w:tcW w:w="2891" w:type="dxa"/>
@@ -8874,12 +8514,6 @@
         </w:tc>
       </w:tr>
       <w:tr>
-        <w:tblPrEx>
-          <w:tblCellMar>
-            <w:top w:w="0" w:type="dxa"/>
-            <w:bottom w:w="0" w:type="dxa"/>
-          </w:tblCellMar>
-        </w:tblPrEx>
         <w:tc>
           <w:tcPr>
             <w:tcW w:w="2891" w:type="dxa"/>
@@ -8950,12 +8584,6 @@
         </w:tc>
       </w:tr>
       <w:tr>
-        <w:tblPrEx>
-          <w:tblCellMar>
-            <w:top w:w="0" w:type="dxa"/>
-            <w:bottom w:w="0" w:type="dxa"/>
-          </w:tblCellMar>
-        </w:tblPrEx>
         <w:tc>
           <w:tcPr>
             <w:tcW w:w="2891" w:type="dxa"/>
@@ -9026,12 +8654,6 @@
         </w:tc>
       </w:tr>
       <w:tr>
-        <w:tblPrEx>
-          <w:tblCellMar>
-            <w:top w:w="0" w:type="dxa"/>
-            <w:bottom w:w="0" w:type="dxa"/>
-          </w:tblCellMar>
-        </w:tblPrEx>
         <w:tc>
           <w:tcPr>
             <w:tcW w:w="2891" w:type="dxa"/>
@@ -9102,12 +8724,6 @@
         </w:tc>
       </w:tr>
       <w:tr>
-        <w:tblPrEx>
-          <w:tblCellMar>
-            <w:top w:w="0" w:type="dxa"/>
-            <w:bottom w:w="0" w:type="dxa"/>
-          </w:tblCellMar>
-        </w:tblPrEx>
         <w:tc>
           <w:tcPr>
             <w:tcW w:w="2891" w:type="dxa"/>
@@ -9178,12 +8794,6 @@
         </w:tc>
       </w:tr>
       <w:tr>
-        <w:tblPrEx>
-          <w:tblCellMar>
-            <w:top w:w="0" w:type="dxa"/>
-            <w:bottom w:w="0" w:type="dxa"/>
-          </w:tblCellMar>
-        </w:tblPrEx>
         <w:tc>
           <w:tcPr>
             <w:tcW w:w="2891" w:type="dxa"/>
@@ -9254,12 +8864,6 @@
         </w:tc>
       </w:tr>
       <w:tr>
-        <w:tblPrEx>
-          <w:tblCellMar>
-            <w:top w:w="0" w:type="dxa"/>
-            <w:bottom w:w="0" w:type="dxa"/>
-          </w:tblCellMar>
-        </w:tblPrEx>
         <w:tc>
           <w:tcPr>
             <w:tcW w:w="2891" w:type="dxa"/>
@@ -9330,12 +8934,6 @@
         </w:tc>
       </w:tr>
       <w:tr>
-        <w:tblPrEx>
-          <w:tblCellMar>
-            <w:top w:w="0" w:type="dxa"/>
-            <w:bottom w:w="0" w:type="dxa"/>
-          </w:tblCellMar>
-        </w:tblPrEx>
         <w:tc>
           <w:tcPr>
             <w:tcW w:w="2891" w:type="dxa"/>
@@ -9406,12 +9004,6 @@
         </w:tc>
       </w:tr>
       <w:tr>
-        <w:tblPrEx>
-          <w:tblCellMar>
-            <w:top w:w="0" w:type="dxa"/>
-            <w:bottom w:w="0" w:type="dxa"/>
-          </w:tblCellMar>
-        </w:tblPrEx>
         <w:tc>
           <w:tcPr>
             <w:tcW w:w="2891" w:type="dxa"/>
@@ -9482,12 +9074,6 @@
         </w:tc>
       </w:tr>
       <w:tr>
-        <w:tblPrEx>
-          <w:tblCellMar>
-            <w:top w:w="0" w:type="dxa"/>
-            <w:bottom w:w="0" w:type="dxa"/>
-          </w:tblCellMar>
-        </w:tblPrEx>
         <w:tc>
           <w:tcPr>
             <w:tcW w:w="2891" w:type="dxa"/>
@@ -9558,12 +9144,6 @@
         </w:tc>
       </w:tr>
       <w:tr>
-        <w:tblPrEx>
-          <w:tblCellMar>
-            <w:top w:w="0" w:type="dxa"/>
-            <w:bottom w:w="0" w:type="dxa"/>
-          </w:tblCellMar>
-        </w:tblPrEx>
         <w:tc>
           <w:tcPr>
             <w:tcW w:w="2891" w:type="dxa"/>
@@ -9831,12 +9411,6 @@
         <w:gridCol w:w="6747"/>
       </w:tblGrid>
       <w:tr>
-        <w:tblPrEx>
-          <w:tblCellMar>
-            <w:top w:w="0" w:type="dxa"/>
-            <w:bottom w:w="0" w:type="dxa"/>
-          </w:tblCellMar>
-        </w:tblPrEx>
         <w:tc>
           <w:tcPr>
             <w:tcW w:w="9638" w:type="dxa"/>
@@ -9876,12 +9450,6 @@
         </w:tc>
       </w:tr>
       <w:tr>
-        <w:tblPrEx>
-          <w:tblCellMar>
-            <w:top w:w="0" w:type="dxa"/>
-            <w:bottom w:w="0" w:type="dxa"/>
-          </w:tblCellMar>
-        </w:tblPrEx>
         <w:tc>
           <w:tcPr>
             <w:tcW w:w="2891" w:type="dxa"/>
@@ -9952,12 +9520,6 @@
         </w:tc>
       </w:tr>
       <w:tr>
-        <w:tblPrEx>
-          <w:tblCellMar>
-            <w:top w:w="0" w:type="dxa"/>
-            <w:bottom w:w="0" w:type="dxa"/>
-          </w:tblCellMar>
-        </w:tblPrEx>
         <w:tc>
           <w:tcPr>
             <w:tcW w:w="2891" w:type="dxa"/>
@@ -10028,12 +9590,6 @@
         </w:tc>
       </w:tr>
       <w:tr>
-        <w:tblPrEx>
-          <w:tblCellMar>
-            <w:top w:w="0" w:type="dxa"/>
-            <w:bottom w:w="0" w:type="dxa"/>
-          </w:tblCellMar>
-        </w:tblPrEx>
         <w:tc>
           <w:tcPr>
             <w:tcW w:w="2891" w:type="dxa"/>
@@ -10104,12 +9660,6 @@
         </w:tc>
       </w:tr>
       <w:tr>
-        <w:tblPrEx>
-          <w:tblCellMar>
-            <w:top w:w="0" w:type="dxa"/>
-            <w:bottom w:w="0" w:type="dxa"/>
-          </w:tblCellMar>
-        </w:tblPrEx>
         <w:tc>
           <w:tcPr>
             <w:tcW w:w="2891" w:type="dxa"/>
@@ -10180,12 +9730,6 @@
         </w:tc>
       </w:tr>
       <w:tr>
-        <w:tblPrEx>
-          <w:tblCellMar>
-            <w:top w:w="0" w:type="dxa"/>
-            <w:bottom w:w="0" w:type="dxa"/>
-          </w:tblCellMar>
-        </w:tblPrEx>
         <w:tc>
           <w:tcPr>
             <w:tcW w:w="2891" w:type="dxa"/>
@@ -10256,12 +9800,6 @@
         </w:tc>
       </w:tr>
       <w:tr>
-        <w:tblPrEx>
-          <w:tblCellMar>
-            <w:top w:w="0" w:type="dxa"/>
-            <w:bottom w:w="0" w:type="dxa"/>
-          </w:tblCellMar>
-        </w:tblPrEx>
         <w:tc>
           <w:tcPr>
             <w:tcW w:w="2891" w:type="dxa"/>
@@ -10332,12 +9870,6 @@
         </w:tc>
       </w:tr>
       <w:tr>
-        <w:tblPrEx>
-          <w:tblCellMar>
-            <w:top w:w="0" w:type="dxa"/>
-            <w:bottom w:w="0" w:type="dxa"/>
-          </w:tblCellMar>
-        </w:tblPrEx>
         <w:tc>
           <w:tcPr>
             <w:tcW w:w="2891" w:type="dxa"/>
@@ -10408,12 +9940,6 @@
         </w:tc>
       </w:tr>
       <w:tr>
-        <w:tblPrEx>
-          <w:tblCellMar>
-            <w:top w:w="0" w:type="dxa"/>
-            <w:bottom w:w="0" w:type="dxa"/>
-          </w:tblCellMar>
-        </w:tblPrEx>
         <w:tc>
           <w:tcPr>
             <w:tcW w:w="2891" w:type="dxa"/>
@@ -10485,12 +10011,6 @@
         </w:tc>
       </w:tr>
       <w:tr>
-        <w:tblPrEx>
-          <w:tblCellMar>
-            <w:top w:w="0" w:type="dxa"/>
-            <w:bottom w:w="0" w:type="dxa"/>
-          </w:tblCellMar>
-        </w:tblPrEx>
         <w:tc>
           <w:tcPr>
             <w:tcW w:w="2891" w:type="dxa"/>
@@ -10561,12 +10081,6 @@
         </w:tc>
       </w:tr>
       <w:tr>
-        <w:tblPrEx>
-          <w:tblCellMar>
-            <w:top w:w="0" w:type="dxa"/>
-            <w:bottom w:w="0" w:type="dxa"/>
-          </w:tblCellMar>
-        </w:tblPrEx>
         <w:tc>
           <w:tcPr>
             <w:tcW w:w="2891" w:type="dxa"/>
@@ -10637,12 +10151,6 @@
         </w:tc>
       </w:tr>
       <w:tr>
-        <w:tblPrEx>
-          <w:tblCellMar>
-            <w:top w:w="0" w:type="dxa"/>
-            <w:bottom w:w="0" w:type="dxa"/>
-          </w:tblCellMar>
-        </w:tblPrEx>
         <w:tc>
           <w:tcPr>
             <w:tcW w:w="2891" w:type="dxa"/>
@@ -10763,12 +10271,6 @@
         <w:gridCol w:w="6747"/>
       </w:tblGrid>
       <w:tr>
-        <w:tblPrEx>
-          <w:tblCellMar>
-            <w:top w:w="0" w:type="dxa"/>
-            <w:bottom w:w="0" w:type="dxa"/>
-          </w:tblCellMar>
-        </w:tblPrEx>
         <w:tc>
           <w:tcPr>
             <w:tcW w:w="9638" w:type="dxa"/>
@@ -10808,12 +10310,6 @@
         </w:tc>
       </w:tr>
       <w:tr>
-        <w:tblPrEx>
-          <w:tblCellMar>
-            <w:top w:w="0" w:type="dxa"/>
-            <w:bottom w:w="0" w:type="dxa"/>
-          </w:tblCellMar>
-        </w:tblPrEx>
         <w:tc>
           <w:tcPr>
             <w:tcW w:w="2891" w:type="dxa"/>
@@ -10884,12 +10380,6 @@
         </w:tc>
       </w:tr>
       <w:tr>
-        <w:tblPrEx>
-          <w:tblCellMar>
-            <w:top w:w="0" w:type="dxa"/>
-            <w:bottom w:w="0" w:type="dxa"/>
-          </w:tblCellMar>
-        </w:tblPrEx>
         <w:tc>
           <w:tcPr>
             <w:tcW w:w="2891" w:type="dxa"/>
@@ -10960,12 +10450,6 @@
         </w:tc>
       </w:tr>
       <w:tr>
-        <w:tblPrEx>
-          <w:tblCellMar>
-            <w:top w:w="0" w:type="dxa"/>
-            <w:bottom w:w="0" w:type="dxa"/>
-          </w:tblCellMar>
-        </w:tblPrEx>
         <w:tc>
           <w:tcPr>
             <w:tcW w:w="2891" w:type="dxa"/>
@@ -11036,12 +10520,6 @@
         </w:tc>
       </w:tr>
       <w:tr>
-        <w:tblPrEx>
-          <w:tblCellMar>
-            <w:top w:w="0" w:type="dxa"/>
-            <w:bottom w:w="0" w:type="dxa"/>
-          </w:tblCellMar>
-        </w:tblPrEx>
         <w:tc>
           <w:tcPr>
             <w:tcW w:w="2891" w:type="dxa"/>
@@ -11112,12 +10590,6 @@
         </w:tc>
       </w:tr>
       <w:tr>
-        <w:tblPrEx>
-          <w:tblCellMar>
-            <w:top w:w="0" w:type="dxa"/>
-            <w:bottom w:w="0" w:type="dxa"/>
-          </w:tblCellMar>
-        </w:tblPrEx>
         <w:tc>
           <w:tcPr>
             <w:tcW w:w="2891" w:type="dxa"/>
@@ -11188,12 +10660,6 @@
         </w:tc>
       </w:tr>
       <w:tr>
-        <w:tblPrEx>
-          <w:tblCellMar>
-            <w:top w:w="0" w:type="dxa"/>
-            <w:bottom w:w="0" w:type="dxa"/>
-          </w:tblCellMar>
-        </w:tblPrEx>
         <w:tc>
           <w:tcPr>
             <w:tcW w:w="2891" w:type="dxa"/>
@@ -11264,12 +10730,6 @@
         </w:tc>
       </w:tr>
       <w:tr>
-        <w:tblPrEx>
-          <w:tblCellMar>
-            <w:top w:w="0" w:type="dxa"/>
-            <w:bottom w:w="0" w:type="dxa"/>
-          </w:tblCellMar>
-        </w:tblPrEx>
         <w:tc>
           <w:tcPr>
             <w:tcW w:w="2891" w:type="dxa"/>
@@ -11340,12 +10800,6 @@
         </w:tc>
       </w:tr>
       <w:tr>
-        <w:tblPrEx>
-          <w:tblCellMar>
-            <w:top w:w="0" w:type="dxa"/>
-            <w:bottom w:w="0" w:type="dxa"/>
-          </w:tblCellMar>
-        </w:tblPrEx>
         <w:tc>
           <w:tcPr>
             <w:tcW w:w="2891" w:type="dxa"/>
@@ -11416,12 +10870,6 @@
         </w:tc>
       </w:tr>
       <w:tr>
-        <w:tblPrEx>
-          <w:tblCellMar>
-            <w:top w:w="0" w:type="dxa"/>
-            <w:bottom w:w="0" w:type="dxa"/>
-          </w:tblCellMar>
-        </w:tblPrEx>
         <w:tc>
           <w:tcPr>
             <w:tcW w:w="2891" w:type="dxa"/>
@@ -11492,12 +10940,6 @@
         </w:tc>
       </w:tr>
       <w:tr>
-        <w:tblPrEx>
-          <w:tblCellMar>
-            <w:top w:w="0" w:type="dxa"/>
-            <w:bottom w:w="0" w:type="dxa"/>
-          </w:tblCellMar>
-        </w:tblPrEx>
         <w:tc>
           <w:tcPr>
             <w:tcW w:w="2891" w:type="dxa"/>
@@ -11568,12 +11010,6 @@
         </w:tc>
       </w:tr>
       <w:tr>
-        <w:tblPrEx>
-          <w:tblCellMar>
-            <w:top w:w="0" w:type="dxa"/>
-            <w:bottom w:w="0" w:type="dxa"/>
-          </w:tblCellMar>
-        </w:tblPrEx>
         <w:tc>
           <w:tcPr>
             <w:tcW w:w="2891" w:type="dxa"/>
@@ -11694,12 +11130,6 @@
         <w:gridCol w:w="6747"/>
       </w:tblGrid>
       <w:tr>
-        <w:tblPrEx>
-          <w:tblCellMar>
-            <w:top w:w="0" w:type="dxa"/>
-            <w:bottom w:w="0" w:type="dxa"/>
-          </w:tblCellMar>
-        </w:tblPrEx>
         <w:tc>
           <w:tcPr>
             <w:tcW w:w="9638" w:type="dxa"/>
@@ -11739,12 +11169,6 @@
         </w:tc>
       </w:tr>
       <w:tr>
-        <w:tblPrEx>
-          <w:tblCellMar>
-            <w:top w:w="0" w:type="dxa"/>
-            <w:bottom w:w="0" w:type="dxa"/>
-          </w:tblCellMar>
-        </w:tblPrEx>
         <w:tc>
           <w:tcPr>
             <w:tcW w:w="2891" w:type="dxa"/>
@@ -11815,12 +11239,6 @@
         </w:tc>
       </w:tr>
       <w:tr>
-        <w:tblPrEx>
-          <w:tblCellMar>
-            <w:top w:w="0" w:type="dxa"/>
-            <w:bottom w:w="0" w:type="dxa"/>
-          </w:tblCellMar>
-        </w:tblPrEx>
         <w:tc>
           <w:tcPr>
             <w:tcW w:w="2891" w:type="dxa"/>
@@ -11891,12 +11309,6 @@
         </w:tc>
       </w:tr>
       <w:tr>
-        <w:tblPrEx>
-          <w:tblCellMar>
-            <w:top w:w="0" w:type="dxa"/>
-            <w:bottom w:w="0" w:type="dxa"/>
-          </w:tblCellMar>
-        </w:tblPrEx>
         <w:tc>
           <w:tcPr>
             <w:tcW w:w="2891" w:type="dxa"/>
@@ -11967,12 +11379,6 @@
         </w:tc>
       </w:tr>
       <w:tr>
-        <w:tblPrEx>
-          <w:tblCellMar>
-            <w:top w:w="0" w:type="dxa"/>
-            <w:bottom w:w="0" w:type="dxa"/>
-          </w:tblCellMar>
-        </w:tblPrEx>
         <w:tc>
           <w:tcPr>
             <w:tcW w:w="2891" w:type="dxa"/>
@@ -12044,12 +11450,6 @@
         </w:tc>
       </w:tr>
       <w:tr>
-        <w:tblPrEx>
-          <w:tblCellMar>
-            <w:top w:w="0" w:type="dxa"/>
-            <w:bottom w:w="0" w:type="dxa"/>
-          </w:tblCellMar>
-        </w:tblPrEx>
         <w:tc>
           <w:tcPr>
             <w:tcW w:w="2891" w:type="dxa"/>
@@ -12120,12 +11520,6 @@
         </w:tc>
       </w:tr>
       <w:tr>
-        <w:tblPrEx>
-          <w:tblCellMar>
-            <w:top w:w="0" w:type="dxa"/>
-            <w:bottom w:w="0" w:type="dxa"/>
-          </w:tblCellMar>
-        </w:tblPrEx>
         <w:tc>
           <w:tcPr>
             <w:tcW w:w="2891" w:type="dxa"/>
@@ -12196,12 +11590,6 @@
         </w:tc>
       </w:tr>
       <w:tr>
-        <w:tblPrEx>
-          <w:tblCellMar>
-            <w:top w:w="0" w:type="dxa"/>
-            <w:bottom w:w="0" w:type="dxa"/>
-          </w:tblCellMar>
-        </w:tblPrEx>
         <w:tc>
           <w:tcPr>
             <w:tcW w:w="2891" w:type="dxa"/>
@@ -12272,12 +11660,6 @@
         </w:tc>
       </w:tr>
       <w:tr>
-        <w:tblPrEx>
-          <w:tblCellMar>
-            <w:top w:w="0" w:type="dxa"/>
-            <w:bottom w:w="0" w:type="dxa"/>
-          </w:tblCellMar>
-        </w:tblPrEx>
         <w:tc>
           <w:tcPr>
             <w:tcW w:w="2891" w:type="dxa"/>
@@ -12348,12 +11730,6 @@
         </w:tc>
       </w:tr>
       <w:tr>
-        <w:tblPrEx>
-          <w:tblCellMar>
-            <w:top w:w="0" w:type="dxa"/>
-            <w:bottom w:w="0" w:type="dxa"/>
-          </w:tblCellMar>
-        </w:tblPrEx>
         <w:tc>
           <w:tcPr>
             <w:tcW w:w="2891" w:type="dxa"/>
@@ -12424,12 +11800,6 @@
         </w:tc>
       </w:tr>
       <w:tr>
-        <w:tblPrEx>
-          <w:tblCellMar>
-            <w:top w:w="0" w:type="dxa"/>
-            <w:bottom w:w="0" w:type="dxa"/>
-          </w:tblCellMar>
-        </w:tblPrEx>
         <w:tc>
           <w:tcPr>
             <w:tcW w:w="2891" w:type="dxa"/>
@@ -12500,12 +11870,6 @@
         </w:tc>
       </w:tr>
       <w:tr>
-        <w:tblPrEx>
-          <w:tblCellMar>
-            <w:top w:w="0" w:type="dxa"/>
-            <w:bottom w:w="0" w:type="dxa"/>
-          </w:tblCellMar>
-        </w:tblPrEx>
         <w:tc>
           <w:tcPr>
             <w:tcW w:w="2891" w:type="dxa"/>
@@ -12626,12 +11990,6 @@
         <w:gridCol w:w="6747"/>
       </w:tblGrid>
       <w:tr>
-        <w:tblPrEx>
-          <w:tblCellMar>
-            <w:top w:w="0" w:type="dxa"/>
-            <w:bottom w:w="0" w:type="dxa"/>
-          </w:tblCellMar>
-        </w:tblPrEx>
         <w:tc>
           <w:tcPr>
             <w:tcW w:w="9638" w:type="dxa"/>
@@ -12671,12 +12029,6 @@
         </w:tc>
       </w:tr>
       <w:tr>
-        <w:tblPrEx>
-          <w:tblCellMar>
-            <w:top w:w="0" w:type="dxa"/>
-            <w:bottom w:w="0" w:type="dxa"/>
-          </w:tblCellMar>
-        </w:tblPrEx>
         <w:tc>
           <w:tcPr>
             <w:tcW w:w="2891" w:type="dxa"/>
@@ -12747,12 +12099,6 @@
         </w:tc>
       </w:tr>
       <w:tr>
-        <w:tblPrEx>
-          <w:tblCellMar>
-            <w:top w:w="0" w:type="dxa"/>
-            <w:bottom w:w="0" w:type="dxa"/>
-          </w:tblCellMar>
-        </w:tblPrEx>
         <w:tc>
           <w:tcPr>
             <w:tcW w:w="2891" w:type="dxa"/>
@@ -12823,12 +12169,6 @@
         </w:tc>
       </w:tr>
       <w:tr>
-        <w:tblPrEx>
-          <w:tblCellMar>
-            <w:top w:w="0" w:type="dxa"/>
-            <w:bottom w:w="0" w:type="dxa"/>
-          </w:tblCellMar>
-        </w:tblPrEx>
         <w:tc>
           <w:tcPr>
             <w:tcW w:w="2891" w:type="dxa"/>
@@ -12899,12 +12239,6 @@
         </w:tc>
       </w:tr>
       <w:tr>
-        <w:tblPrEx>
-          <w:tblCellMar>
-            <w:top w:w="0" w:type="dxa"/>
-            <w:bottom w:w="0" w:type="dxa"/>
-          </w:tblCellMar>
-        </w:tblPrEx>
         <w:tc>
           <w:tcPr>
             <w:tcW w:w="2891" w:type="dxa"/>
@@ -12975,12 +12309,6 @@
         </w:tc>
       </w:tr>
       <w:tr>
-        <w:tblPrEx>
-          <w:tblCellMar>
-            <w:top w:w="0" w:type="dxa"/>
-            <w:bottom w:w="0" w:type="dxa"/>
-          </w:tblCellMar>
-        </w:tblPrEx>
         <w:tc>
           <w:tcPr>
             <w:tcW w:w="2891" w:type="dxa"/>
@@ -13051,12 +12379,6 @@
         </w:tc>
       </w:tr>
       <w:tr>
-        <w:tblPrEx>
-          <w:tblCellMar>
-            <w:top w:w="0" w:type="dxa"/>
-            <w:bottom w:w="0" w:type="dxa"/>
-          </w:tblCellMar>
-        </w:tblPrEx>
         <w:tc>
           <w:tcPr>
             <w:tcW w:w="2891" w:type="dxa"/>
@@ -13127,12 +12449,6 @@
         </w:tc>
       </w:tr>
       <w:tr>
-        <w:tblPrEx>
-          <w:tblCellMar>
-            <w:top w:w="0" w:type="dxa"/>
-            <w:bottom w:w="0" w:type="dxa"/>
-          </w:tblCellMar>
-        </w:tblPrEx>
         <w:tc>
           <w:tcPr>
             <w:tcW w:w="2891" w:type="dxa"/>
@@ -13203,12 +12519,6 @@
         </w:tc>
       </w:tr>
       <w:tr>
-        <w:tblPrEx>
-          <w:tblCellMar>
-            <w:top w:w="0" w:type="dxa"/>
-            <w:bottom w:w="0" w:type="dxa"/>
-          </w:tblCellMar>
-        </w:tblPrEx>
         <w:tc>
           <w:tcPr>
             <w:tcW w:w="2891" w:type="dxa"/>
@@ -13279,12 +12589,6 @@
         </w:tc>
       </w:tr>
       <w:tr>
-        <w:tblPrEx>
-          <w:tblCellMar>
-            <w:top w:w="0" w:type="dxa"/>
-            <w:bottom w:w="0" w:type="dxa"/>
-          </w:tblCellMar>
-        </w:tblPrEx>
         <w:tc>
           <w:tcPr>
             <w:tcW w:w="2891" w:type="dxa"/>
@@ -13355,12 +12659,6 @@
         </w:tc>
       </w:tr>
       <w:tr>
-        <w:tblPrEx>
-          <w:tblCellMar>
-            <w:top w:w="0" w:type="dxa"/>
-            <w:bottom w:w="0" w:type="dxa"/>
-          </w:tblCellMar>
-        </w:tblPrEx>
         <w:tc>
           <w:tcPr>
             <w:tcW w:w="2891" w:type="dxa"/>
@@ -13431,12 +12729,6 @@
         </w:tc>
       </w:tr>
       <w:tr>
-        <w:tblPrEx>
-          <w:tblCellMar>
-            <w:top w:w="0" w:type="dxa"/>
-            <w:bottom w:w="0" w:type="dxa"/>
-          </w:tblCellMar>
-        </w:tblPrEx>
         <w:tc>
           <w:tcPr>
             <w:tcW w:w="2891" w:type="dxa"/>
@@ -13566,6 +12858,17 @@
         <w:spacing w:before="100" w:after="80"/>
         <w:jc w:val="center"/>
         <w:rPr>
+          <w:noProof/>
+          <w:sz w:val="24"/>
+          <w:szCs w:val="24"/>
+        </w:rPr>
+      </w:pPr>
+    </w:p>
+    <w:p>
+      <w:pPr>
+        <w:spacing w:before="100" w:after="80"/>
+        <w:jc w:val="center"/>
+        <w:rPr>
           <w:sz w:val="24"/>
           <w:szCs w:val="24"/>
         </w:rPr>
@@ -13577,8 +12880,8 @@
           <w:szCs w:val="24"/>
         </w:rPr>
         <w:drawing>
-          <wp:inline distT="0" distB="0" distL="0" distR="0" wp14:anchorId="7D878EB7" wp14:editId="547AFCFD">
-            <wp:extent cx="4667250" cy="2009775"/>
+          <wp:inline distT="0" distB="0" distL="0" distR="0" wp14:anchorId="7D878EB7" wp14:editId="78B038F5">
+            <wp:extent cx="2011680" cy="1463040"/>
             <wp:effectExtent l="0" t="0" r="0" b="0"/>
             <wp:docPr id="2085697600" name="image4.png" descr="image4.png" title="image4.png"/>
             <wp:cNvGraphicFramePr>
@@ -13593,9 +12896,9 @@
                       <a:picLocks noChangeAspect="1" noChangeArrowheads="1"/>
                     </pic:cNvPicPr>
                   </pic:nvPicPr>
-                  <pic:blipFill>
+                  <pic:blipFill rotWithShape="1">
                     <a:blip r:embed="rId11"/>
-                    <a:srcRect/>
+                    <a:srcRect r="56898" b="27204"/>
                     <a:stretch>
                       <a:fillRect/>
                     </a:stretch>
@@ -13603,11 +12906,19 @@
                   <pic:spPr bwMode="auto">
                     <a:xfrm>
                       <a:off x="0" y="0"/>
-                      <a:ext cx="4667250" cy="2009775"/>
+                      <a:ext cx="2011680" cy="1463040"/>
                     </a:xfrm>
                     <a:prstGeom prst="rect">
                       <a:avLst/>
                     </a:prstGeom>
+                    <a:ln>
+                      <a:noFill/>
+                    </a:ln>
+                    <a:extLst>
+                      <a:ext uri="{53640926-AAD7-44D8-BBD7-CCE9431645EC}">
+                        <a14:shadowObscured xmlns:a14="http://schemas.microsoft.com/office/drawing/2010/main"/>
+                      </a:ext>
+                    </a:extLst>
                   </pic:spPr>
                 </pic:pic>
               </a:graphicData>
@@ -13703,12 +13014,6 @@
         <w:gridCol w:w="6747"/>
       </w:tblGrid>
       <w:tr>
-        <w:tblPrEx>
-          <w:tblCellMar>
-            <w:top w:w="0" w:type="dxa"/>
-            <w:bottom w:w="0" w:type="dxa"/>
-          </w:tblCellMar>
-        </w:tblPrEx>
         <w:tc>
           <w:tcPr>
             <w:tcW w:w="9638" w:type="dxa"/>
@@ -13748,12 +13053,6 @@
         </w:tc>
       </w:tr>
       <w:tr>
-        <w:tblPrEx>
-          <w:tblCellMar>
-            <w:top w:w="0" w:type="dxa"/>
-            <w:bottom w:w="0" w:type="dxa"/>
-          </w:tblCellMar>
-        </w:tblPrEx>
         <w:tc>
           <w:tcPr>
             <w:tcW w:w="2891" w:type="dxa"/>
@@ -13824,12 +13123,6 @@
         </w:tc>
       </w:tr>
       <w:tr>
-        <w:tblPrEx>
-          <w:tblCellMar>
-            <w:top w:w="0" w:type="dxa"/>
-            <w:bottom w:w="0" w:type="dxa"/>
-          </w:tblCellMar>
-        </w:tblPrEx>
         <w:tc>
           <w:tcPr>
             <w:tcW w:w="2891" w:type="dxa"/>
@@ -13900,12 +13193,6 @@
         </w:tc>
       </w:tr>
       <w:tr>
-        <w:tblPrEx>
-          <w:tblCellMar>
-            <w:top w:w="0" w:type="dxa"/>
-            <w:bottom w:w="0" w:type="dxa"/>
-          </w:tblCellMar>
-        </w:tblPrEx>
         <w:tc>
           <w:tcPr>
             <w:tcW w:w="2891" w:type="dxa"/>
@@ -13976,12 +13263,6 @@
         </w:tc>
       </w:tr>
       <w:tr>
-        <w:tblPrEx>
-          <w:tblCellMar>
-            <w:top w:w="0" w:type="dxa"/>
-            <w:bottom w:w="0" w:type="dxa"/>
-          </w:tblCellMar>
-        </w:tblPrEx>
         <w:tc>
           <w:tcPr>
             <w:tcW w:w="2891" w:type="dxa"/>
@@ -14052,12 +13333,6 @@
         </w:tc>
       </w:tr>
       <w:tr>
-        <w:tblPrEx>
-          <w:tblCellMar>
-            <w:top w:w="0" w:type="dxa"/>
-            <w:bottom w:w="0" w:type="dxa"/>
-          </w:tblCellMar>
-        </w:tblPrEx>
         <w:tc>
           <w:tcPr>
             <w:tcW w:w="2891" w:type="dxa"/>
@@ -14128,12 +13403,6 @@
         </w:tc>
       </w:tr>
       <w:tr>
-        <w:tblPrEx>
-          <w:tblCellMar>
-            <w:top w:w="0" w:type="dxa"/>
-            <w:bottom w:w="0" w:type="dxa"/>
-          </w:tblCellMar>
-        </w:tblPrEx>
         <w:tc>
           <w:tcPr>
             <w:tcW w:w="2891" w:type="dxa"/>
@@ -14204,12 +13473,6 @@
         </w:tc>
       </w:tr>
       <w:tr>
-        <w:tblPrEx>
-          <w:tblCellMar>
-            <w:top w:w="0" w:type="dxa"/>
-            <w:bottom w:w="0" w:type="dxa"/>
-          </w:tblCellMar>
-        </w:tblPrEx>
         <w:tc>
           <w:tcPr>
             <w:tcW w:w="2891" w:type="dxa"/>
@@ -14280,12 +13543,6 @@
         </w:tc>
       </w:tr>
       <w:tr>
-        <w:tblPrEx>
-          <w:tblCellMar>
-            <w:top w:w="0" w:type="dxa"/>
-            <w:bottom w:w="0" w:type="dxa"/>
-          </w:tblCellMar>
-        </w:tblPrEx>
         <w:tc>
           <w:tcPr>
             <w:tcW w:w="2891" w:type="dxa"/>
@@ -14356,12 +13613,6 @@
         </w:tc>
       </w:tr>
       <w:tr>
-        <w:tblPrEx>
-          <w:tblCellMar>
-            <w:top w:w="0" w:type="dxa"/>
-            <w:bottom w:w="0" w:type="dxa"/>
-          </w:tblCellMar>
-        </w:tblPrEx>
         <w:tc>
           <w:tcPr>
             <w:tcW w:w="2891" w:type="dxa"/>
@@ -14432,12 +13683,6 @@
         </w:tc>
       </w:tr>
       <w:tr>
-        <w:tblPrEx>
-          <w:tblCellMar>
-            <w:top w:w="0" w:type="dxa"/>
-            <w:bottom w:w="0" w:type="dxa"/>
-          </w:tblCellMar>
-        </w:tblPrEx>
         <w:tc>
           <w:tcPr>
             <w:tcW w:w="2891" w:type="dxa"/>
@@ -14509,12 +13754,6 @@
         </w:tc>
       </w:tr>
       <w:tr>
-        <w:tblPrEx>
-          <w:tblCellMar>
-            <w:top w:w="0" w:type="dxa"/>
-            <w:bottom w:w="0" w:type="dxa"/>
-          </w:tblCellMar>
-        </w:tblPrEx>
         <w:tc>
           <w:tcPr>
             <w:tcW w:w="2891" w:type="dxa"/>
@@ -14585,12 +13824,6 @@
         </w:tc>
       </w:tr>
       <w:tr>
-        <w:tblPrEx>
-          <w:tblCellMar>
-            <w:top w:w="0" w:type="dxa"/>
-            <w:bottom w:w="0" w:type="dxa"/>
-          </w:tblCellMar>
-        </w:tblPrEx>
         <w:tc>
           <w:tcPr>
             <w:tcW w:w="2891" w:type="dxa"/>
@@ -14858,12 +14091,6 @@
         <w:gridCol w:w="6747"/>
       </w:tblGrid>
       <w:tr>
-        <w:tblPrEx>
-          <w:tblCellMar>
-            <w:top w:w="0" w:type="dxa"/>
-            <w:bottom w:w="0" w:type="dxa"/>
-          </w:tblCellMar>
-        </w:tblPrEx>
         <w:tc>
           <w:tcPr>
             <w:tcW w:w="9638" w:type="dxa"/>
@@ -14903,12 +14130,6 @@
         </w:tc>
       </w:tr>
       <w:tr>
-        <w:tblPrEx>
-          <w:tblCellMar>
-            <w:top w:w="0" w:type="dxa"/>
-            <w:bottom w:w="0" w:type="dxa"/>
-          </w:tblCellMar>
-        </w:tblPrEx>
         <w:tc>
           <w:tcPr>
             <w:tcW w:w="2891" w:type="dxa"/>
@@ -14979,12 +14200,6 @@
         </w:tc>
       </w:tr>
       <w:tr>
-        <w:tblPrEx>
-          <w:tblCellMar>
-            <w:top w:w="0" w:type="dxa"/>
-            <w:bottom w:w="0" w:type="dxa"/>
-          </w:tblCellMar>
-        </w:tblPrEx>
         <w:tc>
           <w:tcPr>
             <w:tcW w:w="2891" w:type="dxa"/>
@@ -15055,12 +14270,6 @@
         </w:tc>
       </w:tr>
       <w:tr>
-        <w:tblPrEx>
-          <w:tblCellMar>
-            <w:top w:w="0" w:type="dxa"/>
-            <w:bottom w:w="0" w:type="dxa"/>
-          </w:tblCellMar>
-        </w:tblPrEx>
         <w:tc>
           <w:tcPr>
             <w:tcW w:w="2891" w:type="dxa"/>
@@ -15132,12 +14341,6 @@
         </w:tc>
       </w:tr>
       <w:tr>
-        <w:tblPrEx>
-          <w:tblCellMar>
-            <w:top w:w="0" w:type="dxa"/>
-            <w:bottom w:w="0" w:type="dxa"/>
-          </w:tblCellMar>
-        </w:tblPrEx>
         <w:tc>
           <w:tcPr>
             <w:tcW w:w="2891" w:type="dxa"/>
@@ -15208,12 +14411,6 @@
         </w:tc>
       </w:tr>
       <w:tr>
-        <w:tblPrEx>
-          <w:tblCellMar>
-            <w:top w:w="0" w:type="dxa"/>
-            <w:bottom w:w="0" w:type="dxa"/>
-          </w:tblCellMar>
-        </w:tblPrEx>
         <w:tc>
           <w:tcPr>
             <w:tcW w:w="2891" w:type="dxa"/>
@@ -15284,12 +14481,6 @@
         </w:tc>
       </w:tr>
       <w:tr>
-        <w:tblPrEx>
-          <w:tblCellMar>
-            <w:top w:w="0" w:type="dxa"/>
-            <w:bottom w:w="0" w:type="dxa"/>
-          </w:tblCellMar>
-        </w:tblPrEx>
         <w:tc>
           <w:tcPr>
             <w:tcW w:w="2891" w:type="dxa"/>
@@ -15360,12 +14551,6 @@
         </w:tc>
       </w:tr>
       <w:tr>
-        <w:tblPrEx>
-          <w:tblCellMar>
-            <w:top w:w="0" w:type="dxa"/>
-            <w:bottom w:w="0" w:type="dxa"/>
-          </w:tblCellMar>
-        </w:tblPrEx>
         <w:tc>
           <w:tcPr>
             <w:tcW w:w="2891" w:type="dxa"/>
@@ -15436,12 +14621,6 @@
         </w:tc>
       </w:tr>
       <w:tr>
-        <w:tblPrEx>
-          <w:tblCellMar>
-            <w:top w:w="0" w:type="dxa"/>
-            <w:bottom w:w="0" w:type="dxa"/>
-          </w:tblCellMar>
-        </w:tblPrEx>
         <w:tc>
           <w:tcPr>
             <w:tcW w:w="2891" w:type="dxa"/>
@@ -15512,12 +14691,6 @@
         </w:tc>
       </w:tr>
       <w:tr>
-        <w:tblPrEx>
-          <w:tblCellMar>
-            <w:top w:w="0" w:type="dxa"/>
-            <w:bottom w:w="0" w:type="dxa"/>
-          </w:tblCellMar>
-        </w:tblPrEx>
         <w:tc>
           <w:tcPr>
             <w:tcW w:w="2891" w:type="dxa"/>
@@ -15588,12 +14761,6 @@
         </w:tc>
       </w:tr>
       <w:tr>
-        <w:tblPrEx>
-          <w:tblCellMar>
-            <w:top w:w="0" w:type="dxa"/>
-            <w:bottom w:w="0" w:type="dxa"/>
-          </w:tblCellMar>
-        </w:tblPrEx>
         <w:tc>
           <w:tcPr>
             <w:tcW w:w="2891" w:type="dxa"/>
@@ -15664,12 +14831,6 @@
         </w:tc>
       </w:tr>
       <w:tr>
-        <w:tblPrEx>
-          <w:tblCellMar>
-            <w:top w:w="0" w:type="dxa"/>
-            <w:bottom w:w="0" w:type="dxa"/>
-          </w:tblCellMar>
-        </w:tblPrEx>
         <w:tc>
           <w:tcPr>
             <w:tcW w:w="2891" w:type="dxa"/>
@@ -15790,12 +14951,6 @@
         <w:gridCol w:w="6747"/>
       </w:tblGrid>
       <w:tr>
-        <w:tblPrEx>
-          <w:tblCellMar>
-            <w:top w:w="0" w:type="dxa"/>
-            <w:bottom w:w="0" w:type="dxa"/>
-          </w:tblCellMar>
-        </w:tblPrEx>
         <w:tc>
           <w:tcPr>
             <w:tcW w:w="9638" w:type="dxa"/>
@@ -15835,12 +14990,6 @@
         </w:tc>
       </w:tr>
       <w:tr>
-        <w:tblPrEx>
-          <w:tblCellMar>
-            <w:top w:w="0" w:type="dxa"/>
-            <w:bottom w:w="0" w:type="dxa"/>
-          </w:tblCellMar>
-        </w:tblPrEx>
         <w:tc>
           <w:tcPr>
             <w:tcW w:w="2891" w:type="dxa"/>
@@ -15911,12 +15060,6 @@
         </w:tc>
       </w:tr>
       <w:tr>
-        <w:tblPrEx>
-          <w:tblCellMar>
-            <w:top w:w="0" w:type="dxa"/>
-            <w:bottom w:w="0" w:type="dxa"/>
-          </w:tblCellMar>
-        </w:tblPrEx>
         <w:tc>
           <w:tcPr>
             <w:tcW w:w="2891" w:type="dxa"/>
@@ -15987,12 +15130,6 @@
         </w:tc>
       </w:tr>
       <w:tr>
-        <w:tblPrEx>
-          <w:tblCellMar>
-            <w:top w:w="0" w:type="dxa"/>
-            <w:bottom w:w="0" w:type="dxa"/>
-          </w:tblCellMar>
-        </w:tblPrEx>
         <w:tc>
           <w:tcPr>
             <w:tcW w:w="2891" w:type="dxa"/>
@@ -16063,12 +15200,6 @@
         </w:tc>
       </w:tr>
       <w:tr>
-        <w:tblPrEx>
-          <w:tblCellMar>
-            <w:top w:w="0" w:type="dxa"/>
-            <w:bottom w:w="0" w:type="dxa"/>
-          </w:tblCellMar>
-        </w:tblPrEx>
         <w:tc>
           <w:tcPr>
             <w:tcW w:w="2891" w:type="dxa"/>
@@ -16139,12 +15270,6 @@
         </w:tc>
       </w:tr>
       <w:tr>
-        <w:tblPrEx>
-          <w:tblCellMar>
-            <w:top w:w="0" w:type="dxa"/>
-            <w:bottom w:w="0" w:type="dxa"/>
-          </w:tblCellMar>
-        </w:tblPrEx>
         <w:tc>
           <w:tcPr>
             <w:tcW w:w="2891" w:type="dxa"/>
@@ -16223,12 +15348,6 @@
         </w:tc>
       </w:tr>
       <w:tr>
-        <w:tblPrEx>
-          <w:tblCellMar>
-            <w:top w:w="0" w:type="dxa"/>
-            <w:bottom w:w="0" w:type="dxa"/>
-          </w:tblCellMar>
-        </w:tblPrEx>
         <w:tc>
           <w:tcPr>
             <w:tcW w:w="2891" w:type="dxa"/>
@@ -16300,12 +15419,6 @@
         </w:tc>
       </w:tr>
       <w:tr>
-        <w:tblPrEx>
-          <w:tblCellMar>
-            <w:top w:w="0" w:type="dxa"/>
-            <w:bottom w:w="0" w:type="dxa"/>
-          </w:tblCellMar>
-        </w:tblPrEx>
         <w:tc>
           <w:tcPr>
             <w:tcW w:w="2891" w:type="dxa"/>
@@ -16376,12 +15489,6 @@
         </w:tc>
       </w:tr>
       <w:tr>
-        <w:tblPrEx>
-          <w:tblCellMar>
-            <w:top w:w="0" w:type="dxa"/>
-            <w:bottom w:w="0" w:type="dxa"/>
-          </w:tblCellMar>
-        </w:tblPrEx>
         <w:tc>
           <w:tcPr>
             <w:tcW w:w="2891" w:type="dxa"/>
@@ -16452,12 +15559,6 @@
         </w:tc>
       </w:tr>
       <w:tr>
-        <w:tblPrEx>
-          <w:tblCellMar>
-            <w:top w:w="0" w:type="dxa"/>
-            <w:bottom w:w="0" w:type="dxa"/>
-          </w:tblCellMar>
-        </w:tblPrEx>
         <w:tc>
           <w:tcPr>
             <w:tcW w:w="2891" w:type="dxa"/>
@@ -16528,12 +15629,6 @@
         </w:tc>
       </w:tr>
       <w:tr>
-        <w:tblPrEx>
-          <w:tblCellMar>
-            <w:top w:w="0" w:type="dxa"/>
-            <w:bottom w:w="0" w:type="dxa"/>
-          </w:tblCellMar>
-        </w:tblPrEx>
         <w:tc>
           <w:tcPr>
             <w:tcW w:w="2891" w:type="dxa"/>
@@ -16604,12 +15699,6 @@
         </w:tc>
       </w:tr>
       <w:tr>
-        <w:tblPrEx>
-          <w:tblCellMar>
-            <w:top w:w="0" w:type="dxa"/>
-            <w:bottom w:w="0" w:type="dxa"/>
-          </w:tblCellMar>
-        </w:tblPrEx>
         <w:tc>
           <w:tcPr>
             <w:tcW w:w="2891" w:type="dxa"/>
@@ -16730,12 +15819,6 @@
         <w:gridCol w:w="6747"/>
       </w:tblGrid>
       <w:tr>
-        <w:tblPrEx>
-          <w:tblCellMar>
-            <w:top w:w="0" w:type="dxa"/>
-            <w:bottom w:w="0" w:type="dxa"/>
-          </w:tblCellMar>
-        </w:tblPrEx>
         <w:tc>
           <w:tcPr>
             <w:tcW w:w="9638" w:type="dxa"/>
@@ -16775,12 +15858,6 @@
         </w:tc>
       </w:tr>
       <w:tr>
-        <w:tblPrEx>
-          <w:tblCellMar>
-            <w:top w:w="0" w:type="dxa"/>
-            <w:bottom w:w="0" w:type="dxa"/>
-          </w:tblCellMar>
-        </w:tblPrEx>
         <w:tc>
           <w:tcPr>
             <w:tcW w:w="2891" w:type="dxa"/>
@@ -16851,12 +15928,6 @@
         </w:tc>
       </w:tr>
       <w:tr>
-        <w:tblPrEx>
-          <w:tblCellMar>
-            <w:top w:w="0" w:type="dxa"/>
-            <w:bottom w:w="0" w:type="dxa"/>
-          </w:tblCellMar>
-        </w:tblPrEx>
         <w:tc>
           <w:tcPr>
             <w:tcW w:w="2891" w:type="dxa"/>
@@ -16927,12 +15998,6 @@
         </w:tc>
       </w:tr>
       <w:tr>
-        <w:tblPrEx>
-          <w:tblCellMar>
-            <w:top w:w="0" w:type="dxa"/>
-            <w:bottom w:w="0" w:type="dxa"/>
-          </w:tblCellMar>
-        </w:tblPrEx>
         <w:tc>
           <w:tcPr>
             <w:tcW w:w="2891" w:type="dxa"/>
@@ -17003,12 +16068,6 @@
         </w:tc>
       </w:tr>
       <w:tr>
-        <w:tblPrEx>
-          <w:tblCellMar>
-            <w:top w:w="0" w:type="dxa"/>
-            <w:bottom w:w="0" w:type="dxa"/>
-          </w:tblCellMar>
-        </w:tblPrEx>
         <w:tc>
           <w:tcPr>
             <w:tcW w:w="2891" w:type="dxa"/>
@@ -17079,12 +16138,6 @@
         </w:tc>
       </w:tr>
       <w:tr>
-        <w:tblPrEx>
-          <w:tblCellMar>
-            <w:top w:w="0" w:type="dxa"/>
-            <w:bottom w:w="0" w:type="dxa"/>
-          </w:tblCellMar>
-        </w:tblPrEx>
         <w:tc>
           <w:tcPr>
             <w:tcW w:w="2891" w:type="dxa"/>
@@ -17155,12 +16208,6 @@
         </w:tc>
       </w:tr>
       <w:tr>
-        <w:tblPrEx>
-          <w:tblCellMar>
-            <w:top w:w="0" w:type="dxa"/>
-            <w:bottom w:w="0" w:type="dxa"/>
-          </w:tblCellMar>
-        </w:tblPrEx>
         <w:tc>
           <w:tcPr>
             <w:tcW w:w="2891" w:type="dxa"/>
@@ -17231,12 +16278,6 @@
         </w:tc>
       </w:tr>
       <w:tr>
-        <w:tblPrEx>
-          <w:tblCellMar>
-            <w:top w:w="0" w:type="dxa"/>
-            <w:bottom w:w="0" w:type="dxa"/>
-          </w:tblCellMar>
-        </w:tblPrEx>
         <w:tc>
           <w:tcPr>
             <w:tcW w:w="2891" w:type="dxa"/>
@@ -17307,12 +16348,6 @@
         </w:tc>
       </w:tr>
       <w:tr>
-        <w:tblPrEx>
-          <w:tblCellMar>
-            <w:top w:w="0" w:type="dxa"/>
-            <w:bottom w:w="0" w:type="dxa"/>
-          </w:tblCellMar>
-        </w:tblPrEx>
         <w:tc>
           <w:tcPr>
             <w:tcW w:w="2891" w:type="dxa"/>
@@ -17383,12 +16418,6 @@
         </w:tc>
       </w:tr>
       <w:tr>
-        <w:tblPrEx>
-          <w:tblCellMar>
-            <w:top w:w="0" w:type="dxa"/>
-            <w:bottom w:w="0" w:type="dxa"/>
-          </w:tblCellMar>
-        </w:tblPrEx>
         <w:tc>
           <w:tcPr>
             <w:tcW w:w="2891" w:type="dxa"/>
@@ -17460,12 +16489,6 @@
         </w:tc>
       </w:tr>
       <w:tr>
-        <w:tblPrEx>
-          <w:tblCellMar>
-            <w:top w:w="0" w:type="dxa"/>
-            <w:bottom w:w="0" w:type="dxa"/>
-          </w:tblCellMar>
-        </w:tblPrEx>
         <w:tc>
           <w:tcPr>
             <w:tcW w:w="2891" w:type="dxa"/>
@@ -17536,12 +16559,6 @@
         </w:tc>
       </w:tr>
       <w:tr>
-        <w:tblPrEx>
-          <w:tblCellMar>
-            <w:top w:w="0" w:type="dxa"/>
-            <w:bottom w:w="0" w:type="dxa"/>
-          </w:tblCellMar>
-        </w:tblPrEx>
         <w:tc>
           <w:tcPr>
             <w:tcW w:w="2891" w:type="dxa"/>
@@ -17809,12 +16826,6 @@
         <w:gridCol w:w="6747"/>
       </w:tblGrid>
       <w:tr>
-        <w:tblPrEx>
-          <w:tblCellMar>
-            <w:top w:w="0" w:type="dxa"/>
-            <w:bottom w:w="0" w:type="dxa"/>
-          </w:tblCellMar>
-        </w:tblPrEx>
         <w:tc>
           <w:tcPr>
             <w:tcW w:w="9638" w:type="dxa"/>
@@ -17854,12 +16865,6 @@
         </w:tc>
       </w:tr>
       <w:tr>
-        <w:tblPrEx>
-          <w:tblCellMar>
-            <w:top w:w="0" w:type="dxa"/>
-            <w:bottom w:w="0" w:type="dxa"/>
-          </w:tblCellMar>
-        </w:tblPrEx>
         <w:tc>
           <w:tcPr>
             <w:tcW w:w="2891" w:type="dxa"/>
@@ -17930,12 +16935,6 @@
         </w:tc>
       </w:tr>
       <w:tr>
-        <w:tblPrEx>
-          <w:tblCellMar>
-            <w:top w:w="0" w:type="dxa"/>
-            <w:bottom w:w="0" w:type="dxa"/>
-          </w:tblCellMar>
-        </w:tblPrEx>
         <w:tc>
           <w:tcPr>
             <w:tcW w:w="2891" w:type="dxa"/>
@@ -18006,12 +17005,6 @@
         </w:tc>
       </w:tr>
       <w:tr>
-        <w:tblPrEx>
-          <w:tblCellMar>
-            <w:top w:w="0" w:type="dxa"/>
-            <w:bottom w:w="0" w:type="dxa"/>
-          </w:tblCellMar>
-        </w:tblPrEx>
         <w:tc>
           <w:tcPr>
             <w:tcW w:w="2891" w:type="dxa"/>
@@ -18082,12 +17075,6 @@
         </w:tc>
       </w:tr>
       <w:tr>
-        <w:tblPrEx>
-          <w:tblCellMar>
-            <w:top w:w="0" w:type="dxa"/>
-            <w:bottom w:w="0" w:type="dxa"/>
-          </w:tblCellMar>
-        </w:tblPrEx>
         <w:tc>
           <w:tcPr>
             <w:tcW w:w="2891" w:type="dxa"/>
@@ -18158,12 +17145,6 @@
         </w:tc>
       </w:tr>
       <w:tr>
-        <w:tblPrEx>
-          <w:tblCellMar>
-            <w:top w:w="0" w:type="dxa"/>
-            <w:bottom w:w="0" w:type="dxa"/>
-          </w:tblCellMar>
-        </w:tblPrEx>
         <w:tc>
           <w:tcPr>
             <w:tcW w:w="2891" w:type="dxa"/>
@@ -18234,12 +17215,6 @@
         </w:tc>
       </w:tr>
       <w:tr>
-        <w:tblPrEx>
-          <w:tblCellMar>
-            <w:top w:w="0" w:type="dxa"/>
-            <w:bottom w:w="0" w:type="dxa"/>
-          </w:tblCellMar>
-        </w:tblPrEx>
         <w:tc>
           <w:tcPr>
             <w:tcW w:w="2891" w:type="dxa"/>
@@ -18311,12 +17286,6 @@
         </w:tc>
       </w:tr>
       <w:tr>
-        <w:tblPrEx>
-          <w:tblCellMar>
-            <w:top w:w="0" w:type="dxa"/>
-            <w:bottom w:w="0" w:type="dxa"/>
-          </w:tblCellMar>
-        </w:tblPrEx>
         <w:tc>
           <w:tcPr>
             <w:tcW w:w="2891" w:type="dxa"/>
@@ -18387,12 +17356,6 @@
         </w:tc>
       </w:tr>
       <w:tr>
-        <w:tblPrEx>
-          <w:tblCellMar>
-            <w:top w:w="0" w:type="dxa"/>
-            <w:bottom w:w="0" w:type="dxa"/>
-          </w:tblCellMar>
-        </w:tblPrEx>
         <w:tc>
           <w:tcPr>
             <w:tcW w:w="2891" w:type="dxa"/>
@@ -18463,12 +17426,6 @@
         </w:tc>
       </w:tr>
       <w:tr>
-        <w:tblPrEx>
-          <w:tblCellMar>
-            <w:top w:w="0" w:type="dxa"/>
-            <w:bottom w:w="0" w:type="dxa"/>
-          </w:tblCellMar>
-        </w:tblPrEx>
         <w:tc>
           <w:tcPr>
             <w:tcW w:w="2891" w:type="dxa"/>
@@ -18539,12 +17496,6 @@
         </w:tc>
       </w:tr>
       <w:tr>
-        <w:tblPrEx>
-          <w:tblCellMar>
-            <w:top w:w="0" w:type="dxa"/>
-            <w:bottom w:w="0" w:type="dxa"/>
-          </w:tblCellMar>
-        </w:tblPrEx>
         <w:tc>
           <w:tcPr>
             <w:tcW w:w="2891" w:type="dxa"/>
@@ -18615,12 +17566,6 @@
         </w:tc>
       </w:tr>
       <w:tr>
-        <w:tblPrEx>
-          <w:tblCellMar>
-            <w:top w:w="0" w:type="dxa"/>
-            <w:bottom w:w="0" w:type="dxa"/>
-          </w:tblCellMar>
-        </w:tblPrEx>
         <w:tc>
           <w:tcPr>
             <w:tcW w:w="2891" w:type="dxa"/>
@@ -18888,12 +17833,6 @@
         <w:gridCol w:w="6747"/>
       </w:tblGrid>
       <w:tr>
-        <w:tblPrEx>
-          <w:tblCellMar>
-            <w:top w:w="0" w:type="dxa"/>
-            <w:bottom w:w="0" w:type="dxa"/>
-          </w:tblCellMar>
-        </w:tblPrEx>
         <w:tc>
           <w:tcPr>
             <w:tcW w:w="9638" w:type="dxa"/>
@@ -18933,12 +17872,6 @@
         </w:tc>
       </w:tr>
       <w:tr>
-        <w:tblPrEx>
-          <w:tblCellMar>
-            <w:top w:w="0" w:type="dxa"/>
-            <w:bottom w:w="0" w:type="dxa"/>
-          </w:tblCellMar>
-        </w:tblPrEx>
         <w:tc>
           <w:tcPr>
             <w:tcW w:w="2891" w:type="dxa"/>
@@ -19009,12 +17942,6 @@
         </w:tc>
       </w:tr>
       <w:tr>
-        <w:tblPrEx>
-          <w:tblCellMar>
-            <w:top w:w="0" w:type="dxa"/>
-            <w:bottom w:w="0" w:type="dxa"/>
-          </w:tblCellMar>
-        </w:tblPrEx>
         <w:tc>
           <w:tcPr>
             <w:tcW w:w="2891" w:type="dxa"/>
@@ -19085,12 +18012,6 @@
         </w:tc>
       </w:tr>
       <w:tr>
-        <w:tblPrEx>
-          <w:tblCellMar>
-            <w:top w:w="0" w:type="dxa"/>
-            <w:bottom w:w="0" w:type="dxa"/>
-          </w:tblCellMar>
-        </w:tblPrEx>
         <w:tc>
           <w:tcPr>
             <w:tcW w:w="2891" w:type="dxa"/>
@@ -19161,12 +18082,6 @@
         </w:tc>
       </w:tr>
       <w:tr>
-        <w:tblPrEx>
-          <w:tblCellMar>
-            <w:top w:w="0" w:type="dxa"/>
-            <w:bottom w:w="0" w:type="dxa"/>
-          </w:tblCellMar>
-        </w:tblPrEx>
         <w:tc>
           <w:tcPr>
             <w:tcW w:w="2891" w:type="dxa"/>
@@ -19237,12 +18152,6 @@
         </w:tc>
       </w:tr>
       <w:tr>
-        <w:tblPrEx>
-          <w:tblCellMar>
-            <w:top w:w="0" w:type="dxa"/>
-            <w:bottom w:w="0" w:type="dxa"/>
-          </w:tblCellMar>
-        </w:tblPrEx>
         <w:tc>
           <w:tcPr>
             <w:tcW w:w="2891" w:type="dxa"/>
@@ -19313,12 +18222,6 @@
         </w:tc>
       </w:tr>
       <w:tr>
-        <w:tblPrEx>
-          <w:tblCellMar>
-            <w:top w:w="0" w:type="dxa"/>
-            <w:bottom w:w="0" w:type="dxa"/>
-          </w:tblCellMar>
-        </w:tblPrEx>
         <w:tc>
           <w:tcPr>
             <w:tcW w:w="2891" w:type="dxa"/>
@@ -19389,12 +18292,6 @@
         </w:tc>
       </w:tr>
       <w:tr>
-        <w:tblPrEx>
-          <w:tblCellMar>
-            <w:top w:w="0" w:type="dxa"/>
-            <w:bottom w:w="0" w:type="dxa"/>
-          </w:tblCellMar>
-        </w:tblPrEx>
         <w:tc>
           <w:tcPr>
             <w:tcW w:w="2891" w:type="dxa"/>
@@ -19465,12 +18362,6 @@
         </w:tc>
       </w:tr>
       <w:tr>
-        <w:tblPrEx>
-          <w:tblCellMar>
-            <w:top w:w="0" w:type="dxa"/>
-            <w:bottom w:w="0" w:type="dxa"/>
-          </w:tblCellMar>
-        </w:tblPrEx>
         <w:tc>
           <w:tcPr>
             <w:tcW w:w="2891" w:type="dxa"/>
@@ -19542,12 +18433,6 @@
         </w:tc>
       </w:tr>
       <w:tr>
-        <w:tblPrEx>
-          <w:tblCellMar>
-            <w:top w:w="0" w:type="dxa"/>
-            <w:bottom w:w="0" w:type="dxa"/>
-          </w:tblCellMar>
-        </w:tblPrEx>
         <w:tc>
           <w:tcPr>
             <w:tcW w:w="2891" w:type="dxa"/>
@@ -19618,12 +18503,6 @@
         </w:tc>
       </w:tr>
       <w:tr>
-        <w:tblPrEx>
-          <w:tblCellMar>
-            <w:top w:w="0" w:type="dxa"/>
-            <w:bottom w:w="0" w:type="dxa"/>
-          </w:tblCellMar>
-        </w:tblPrEx>
         <w:tc>
           <w:tcPr>
             <w:tcW w:w="2891" w:type="dxa"/>
@@ -19694,12 +18573,6 @@
         </w:tc>
       </w:tr>
       <w:tr>
-        <w:tblPrEx>
-          <w:tblCellMar>
-            <w:top w:w="0" w:type="dxa"/>
-            <w:bottom w:w="0" w:type="dxa"/>
-          </w:tblCellMar>
-        </w:tblPrEx>
         <w:tc>
           <w:tcPr>
             <w:tcW w:w="2891" w:type="dxa"/>
@@ -19820,12 +18693,6 @@
         <w:gridCol w:w="6747"/>
       </w:tblGrid>
       <w:tr>
-        <w:tblPrEx>
-          <w:tblCellMar>
-            <w:top w:w="0" w:type="dxa"/>
-            <w:bottom w:w="0" w:type="dxa"/>
-          </w:tblCellMar>
-        </w:tblPrEx>
         <w:tc>
           <w:tcPr>
             <w:tcW w:w="9638" w:type="dxa"/>
@@ -19865,12 +18732,6 @@
         </w:tc>
       </w:tr>
       <w:tr>
-        <w:tblPrEx>
-          <w:tblCellMar>
-            <w:top w:w="0" w:type="dxa"/>
-            <w:bottom w:w="0" w:type="dxa"/>
-          </w:tblCellMar>
-        </w:tblPrEx>
         <w:tc>
           <w:tcPr>
             <w:tcW w:w="2891" w:type="dxa"/>
@@ -19941,12 +18802,6 @@
         </w:tc>
       </w:tr>
       <w:tr>
-        <w:tblPrEx>
-          <w:tblCellMar>
-            <w:top w:w="0" w:type="dxa"/>
-            <w:bottom w:w="0" w:type="dxa"/>
-          </w:tblCellMar>
-        </w:tblPrEx>
         <w:tc>
           <w:tcPr>
             <w:tcW w:w="2891" w:type="dxa"/>
@@ -20017,12 +18872,6 @@
         </w:tc>
       </w:tr>
       <w:tr>
-        <w:tblPrEx>
-          <w:tblCellMar>
-            <w:top w:w="0" w:type="dxa"/>
-            <w:bottom w:w="0" w:type="dxa"/>
-          </w:tblCellMar>
-        </w:tblPrEx>
         <w:tc>
           <w:tcPr>
             <w:tcW w:w="2891" w:type="dxa"/>
@@ -20093,12 +18942,6 @@
         </w:tc>
       </w:tr>
       <w:tr>
-        <w:tblPrEx>
-          <w:tblCellMar>
-            <w:top w:w="0" w:type="dxa"/>
-            <w:bottom w:w="0" w:type="dxa"/>
-          </w:tblCellMar>
-        </w:tblPrEx>
         <w:tc>
           <w:tcPr>
             <w:tcW w:w="2891" w:type="dxa"/>
@@ -20169,12 +19012,6 @@
         </w:tc>
       </w:tr>
       <w:tr>
-        <w:tblPrEx>
-          <w:tblCellMar>
-            <w:top w:w="0" w:type="dxa"/>
-            <w:bottom w:w="0" w:type="dxa"/>
-          </w:tblCellMar>
-        </w:tblPrEx>
         <w:tc>
           <w:tcPr>
             <w:tcW w:w="2891" w:type="dxa"/>
@@ -20245,12 +19082,6 @@
         </w:tc>
       </w:tr>
       <w:tr>
-        <w:tblPrEx>
-          <w:tblCellMar>
-            <w:top w:w="0" w:type="dxa"/>
-            <w:bottom w:w="0" w:type="dxa"/>
-          </w:tblCellMar>
-        </w:tblPrEx>
         <w:tc>
           <w:tcPr>
             <w:tcW w:w="2891" w:type="dxa"/>
@@ -20321,12 +19152,6 @@
         </w:tc>
       </w:tr>
       <w:tr>
-        <w:tblPrEx>
-          <w:tblCellMar>
-            <w:top w:w="0" w:type="dxa"/>
-            <w:bottom w:w="0" w:type="dxa"/>
-          </w:tblCellMar>
-        </w:tblPrEx>
         <w:tc>
           <w:tcPr>
             <w:tcW w:w="2891" w:type="dxa"/>
@@ -20397,12 +19222,6 @@
         </w:tc>
       </w:tr>
       <w:tr>
-        <w:tblPrEx>
-          <w:tblCellMar>
-            <w:top w:w="0" w:type="dxa"/>
-            <w:bottom w:w="0" w:type="dxa"/>
-          </w:tblCellMar>
-        </w:tblPrEx>
         <w:tc>
           <w:tcPr>
             <w:tcW w:w="2891" w:type="dxa"/>
@@ -20473,12 +19292,6 @@
         </w:tc>
       </w:tr>
       <w:tr>
-        <w:tblPrEx>
-          <w:tblCellMar>
-            <w:top w:w="0" w:type="dxa"/>
-            <w:bottom w:w="0" w:type="dxa"/>
-          </w:tblCellMar>
-        </w:tblPrEx>
         <w:tc>
           <w:tcPr>
             <w:tcW w:w="2891" w:type="dxa"/>
@@ -20549,12 +19362,6 @@
         </w:tc>
       </w:tr>
       <w:tr>
-        <w:tblPrEx>
-          <w:tblCellMar>
-            <w:top w:w="0" w:type="dxa"/>
-            <w:bottom w:w="0" w:type="dxa"/>
-          </w:tblCellMar>
-        </w:tblPrEx>
         <w:tc>
           <w:tcPr>
             <w:tcW w:w="2891" w:type="dxa"/>
@@ -20625,12 +19432,6 @@
         </w:tc>
       </w:tr>
       <w:tr>
-        <w:tblPrEx>
-          <w:tblCellMar>
-            <w:top w:w="0" w:type="dxa"/>
-            <w:bottom w:w="0" w:type="dxa"/>
-          </w:tblCellMar>
-        </w:tblPrEx>
         <w:tc>
           <w:tcPr>
             <w:tcW w:w="2891" w:type="dxa"/>
@@ -20751,12 +19552,6 @@
         <w:gridCol w:w="6747"/>
       </w:tblGrid>
       <w:tr>
-        <w:tblPrEx>
-          <w:tblCellMar>
-            <w:top w:w="0" w:type="dxa"/>
-            <w:bottom w:w="0" w:type="dxa"/>
-          </w:tblCellMar>
-        </w:tblPrEx>
         <w:tc>
           <w:tcPr>
             <w:tcW w:w="9638" w:type="dxa"/>
@@ -20796,12 +19591,6 @@
         </w:tc>
       </w:tr>
       <w:tr>
-        <w:tblPrEx>
-          <w:tblCellMar>
-            <w:top w:w="0" w:type="dxa"/>
-            <w:bottom w:w="0" w:type="dxa"/>
-          </w:tblCellMar>
-        </w:tblPrEx>
         <w:tc>
           <w:tcPr>
             <w:tcW w:w="2891" w:type="dxa"/>
@@ -20872,12 +19661,6 @@
         </w:tc>
       </w:tr>
       <w:tr>
-        <w:tblPrEx>
-          <w:tblCellMar>
-            <w:top w:w="0" w:type="dxa"/>
-            <w:bottom w:w="0" w:type="dxa"/>
-          </w:tblCellMar>
-        </w:tblPrEx>
         <w:tc>
           <w:tcPr>
             <w:tcW w:w="2891" w:type="dxa"/>
@@ -20948,12 +19731,6 @@
         </w:tc>
       </w:tr>
       <w:tr>
-        <w:tblPrEx>
-          <w:tblCellMar>
-            <w:top w:w="0" w:type="dxa"/>
-            <w:bottom w:w="0" w:type="dxa"/>
-          </w:tblCellMar>
-        </w:tblPrEx>
         <w:tc>
           <w:tcPr>
             <w:tcW w:w="2891" w:type="dxa"/>
@@ -21024,12 +19801,6 @@
         </w:tc>
       </w:tr>
       <w:tr>
-        <w:tblPrEx>
-          <w:tblCellMar>
-            <w:top w:w="0" w:type="dxa"/>
-            <w:bottom w:w="0" w:type="dxa"/>
-          </w:tblCellMar>
-        </w:tblPrEx>
         <w:tc>
           <w:tcPr>
             <w:tcW w:w="2891" w:type="dxa"/>
@@ -21101,12 +19872,6 @@
         </w:tc>
       </w:tr>
       <w:tr>
-        <w:tblPrEx>
-          <w:tblCellMar>
-            <w:top w:w="0" w:type="dxa"/>
-            <w:bottom w:w="0" w:type="dxa"/>
-          </w:tblCellMar>
-        </w:tblPrEx>
         <w:tc>
           <w:tcPr>
             <w:tcW w:w="2891" w:type="dxa"/>
@@ -21177,12 +19942,6 @@
         </w:tc>
       </w:tr>
       <w:tr>
-        <w:tblPrEx>
-          <w:tblCellMar>
-            <w:top w:w="0" w:type="dxa"/>
-            <w:bottom w:w="0" w:type="dxa"/>
-          </w:tblCellMar>
-        </w:tblPrEx>
         <w:tc>
           <w:tcPr>
             <w:tcW w:w="2891" w:type="dxa"/>
@@ -21253,12 +20012,6 @@
         </w:tc>
       </w:tr>
       <w:tr>
-        <w:tblPrEx>
-          <w:tblCellMar>
-            <w:top w:w="0" w:type="dxa"/>
-            <w:bottom w:w="0" w:type="dxa"/>
-          </w:tblCellMar>
-        </w:tblPrEx>
         <w:tc>
           <w:tcPr>
             <w:tcW w:w="2891" w:type="dxa"/>
@@ -21329,12 +20082,6 @@
         </w:tc>
       </w:tr>
       <w:tr>
-        <w:tblPrEx>
-          <w:tblCellMar>
-            <w:top w:w="0" w:type="dxa"/>
-            <w:bottom w:w="0" w:type="dxa"/>
-          </w:tblCellMar>
-        </w:tblPrEx>
         <w:tc>
           <w:tcPr>
             <w:tcW w:w="2891" w:type="dxa"/>
@@ -21405,12 +20152,6 @@
         </w:tc>
       </w:tr>
       <w:tr>
-        <w:tblPrEx>
-          <w:tblCellMar>
-            <w:top w:w="0" w:type="dxa"/>
-            <w:bottom w:w="0" w:type="dxa"/>
-          </w:tblCellMar>
-        </w:tblPrEx>
         <w:tc>
           <w:tcPr>
             <w:tcW w:w="2891" w:type="dxa"/>
@@ -21481,12 +20222,6 @@
         </w:tc>
       </w:tr>
       <w:tr>
-        <w:tblPrEx>
-          <w:tblCellMar>
-            <w:top w:w="0" w:type="dxa"/>
-            <w:bottom w:w="0" w:type="dxa"/>
-          </w:tblCellMar>
-        </w:tblPrEx>
         <w:tc>
           <w:tcPr>
             <w:tcW w:w="2891" w:type="dxa"/>
@@ -21557,12 +20292,6 @@
         </w:tc>
       </w:tr>
       <w:tr>
-        <w:tblPrEx>
-          <w:tblCellMar>
-            <w:top w:w="0" w:type="dxa"/>
-            <w:bottom w:w="0" w:type="dxa"/>
-          </w:tblCellMar>
-        </w:tblPrEx>
         <w:tc>
           <w:tcPr>
             <w:tcW w:w="2891" w:type="dxa"/>
@@ -21683,12 +20412,6 @@
         <w:gridCol w:w="6747"/>
       </w:tblGrid>
       <w:tr>
-        <w:tblPrEx>
-          <w:tblCellMar>
-            <w:top w:w="0" w:type="dxa"/>
-            <w:bottom w:w="0" w:type="dxa"/>
-          </w:tblCellMar>
-        </w:tblPrEx>
         <w:tc>
           <w:tcPr>
             <w:tcW w:w="9638" w:type="dxa"/>
@@ -21728,12 +20451,6 @@
         </w:tc>
       </w:tr>
       <w:tr>
-        <w:tblPrEx>
-          <w:tblCellMar>
-            <w:top w:w="0" w:type="dxa"/>
-            <w:bottom w:w="0" w:type="dxa"/>
-          </w:tblCellMar>
-        </w:tblPrEx>
         <w:tc>
           <w:tcPr>
             <w:tcW w:w="2891" w:type="dxa"/>
@@ -21804,12 +20521,6 @@
         </w:tc>
       </w:tr>
       <w:tr>
-        <w:tblPrEx>
-          <w:tblCellMar>
-            <w:top w:w="0" w:type="dxa"/>
-            <w:bottom w:w="0" w:type="dxa"/>
-          </w:tblCellMar>
-        </w:tblPrEx>
         <w:tc>
           <w:tcPr>
             <w:tcW w:w="2891" w:type="dxa"/>
@@ -21880,12 +20591,6 @@
         </w:tc>
       </w:tr>
       <w:tr>
-        <w:tblPrEx>
-          <w:tblCellMar>
-            <w:top w:w="0" w:type="dxa"/>
-            <w:bottom w:w="0" w:type="dxa"/>
-          </w:tblCellMar>
-        </w:tblPrEx>
         <w:tc>
           <w:tcPr>
             <w:tcW w:w="2891" w:type="dxa"/>
@@ -21956,12 +20661,6 @@
         </w:tc>
       </w:tr>
       <w:tr>
-        <w:tblPrEx>
-          <w:tblCellMar>
-            <w:top w:w="0" w:type="dxa"/>
-            <w:bottom w:w="0" w:type="dxa"/>
-          </w:tblCellMar>
-        </w:tblPrEx>
         <w:tc>
           <w:tcPr>
             <w:tcW w:w="2891" w:type="dxa"/>
@@ -22032,12 +20731,6 @@
         </w:tc>
       </w:tr>
       <w:tr>
-        <w:tblPrEx>
-          <w:tblCellMar>
-            <w:top w:w="0" w:type="dxa"/>
-            <w:bottom w:w="0" w:type="dxa"/>
-          </w:tblCellMar>
-        </w:tblPrEx>
         <w:tc>
           <w:tcPr>
             <w:tcW w:w="2891" w:type="dxa"/>
@@ -22108,12 +20801,6 @@
         </w:tc>
       </w:tr>
       <w:tr>
-        <w:tblPrEx>
-          <w:tblCellMar>
-            <w:top w:w="0" w:type="dxa"/>
-            <w:bottom w:w="0" w:type="dxa"/>
-          </w:tblCellMar>
-        </w:tblPrEx>
         <w:tc>
           <w:tcPr>
             <w:tcW w:w="2891" w:type="dxa"/>
@@ -22184,12 +20871,6 @@
         </w:tc>
       </w:tr>
       <w:tr>
-        <w:tblPrEx>
-          <w:tblCellMar>
-            <w:top w:w="0" w:type="dxa"/>
-            <w:bottom w:w="0" w:type="dxa"/>
-          </w:tblCellMar>
-        </w:tblPrEx>
         <w:tc>
           <w:tcPr>
             <w:tcW w:w="2891" w:type="dxa"/>
@@ -22260,12 +20941,6 @@
         </w:tc>
       </w:tr>
       <w:tr>
-        <w:tblPrEx>
-          <w:tblCellMar>
-            <w:top w:w="0" w:type="dxa"/>
-            <w:bottom w:w="0" w:type="dxa"/>
-          </w:tblCellMar>
-        </w:tblPrEx>
         <w:tc>
           <w:tcPr>
             <w:tcW w:w="2891" w:type="dxa"/>
@@ -22336,12 +21011,6 @@
         </w:tc>
       </w:tr>
       <w:tr>
-        <w:tblPrEx>
-          <w:tblCellMar>
-            <w:top w:w="0" w:type="dxa"/>
-            <w:bottom w:w="0" w:type="dxa"/>
-          </w:tblCellMar>
-        </w:tblPrEx>
         <w:tc>
           <w:tcPr>
             <w:tcW w:w="2891" w:type="dxa"/>
@@ -22412,12 +21081,6 @@
         </w:tc>
       </w:tr>
       <w:tr>
-        <w:tblPrEx>
-          <w:tblCellMar>
-            <w:top w:w="0" w:type="dxa"/>
-            <w:bottom w:w="0" w:type="dxa"/>
-          </w:tblCellMar>
-        </w:tblPrEx>
         <w:tc>
           <w:tcPr>
             <w:tcW w:w="2891" w:type="dxa"/>
@@ -22488,12 +21151,6 @@
         </w:tc>
       </w:tr>
       <w:tr>
-        <w:tblPrEx>
-          <w:tblCellMar>
-            <w:top w:w="0" w:type="dxa"/>
-            <w:bottom w:w="0" w:type="dxa"/>
-          </w:tblCellMar>
-        </w:tblPrEx>
         <w:tc>
           <w:tcPr>
             <w:tcW w:w="2891" w:type="dxa"/>
@@ -22615,12 +21272,6 @@
         <w:gridCol w:w="6747"/>
       </w:tblGrid>
       <w:tr>
-        <w:tblPrEx>
-          <w:tblCellMar>
-            <w:top w:w="0" w:type="dxa"/>
-            <w:bottom w:w="0" w:type="dxa"/>
-          </w:tblCellMar>
-        </w:tblPrEx>
         <w:tc>
           <w:tcPr>
             <w:tcW w:w="9638" w:type="dxa"/>
@@ -22660,12 +21311,6 @@
         </w:tc>
       </w:tr>
       <w:tr>
-        <w:tblPrEx>
-          <w:tblCellMar>
-            <w:top w:w="0" w:type="dxa"/>
-            <w:bottom w:w="0" w:type="dxa"/>
-          </w:tblCellMar>
-        </w:tblPrEx>
         <w:tc>
           <w:tcPr>
             <w:tcW w:w="2891" w:type="dxa"/>
@@ -22736,12 +21381,6 @@
         </w:tc>
       </w:tr>
       <w:tr>
-        <w:tblPrEx>
-          <w:tblCellMar>
-            <w:top w:w="0" w:type="dxa"/>
-            <w:bottom w:w="0" w:type="dxa"/>
-          </w:tblCellMar>
-        </w:tblPrEx>
         <w:tc>
           <w:tcPr>
             <w:tcW w:w="2891" w:type="dxa"/>
@@ -22812,12 +21451,6 @@
         </w:tc>
       </w:tr>
       <w:tr>
-        <w:tblPrEx>
-          <w:tblCellMar>
-            <w:top w:w="0" w:type="dxa"/>
-            <w:bottom w:w="0" w:type="dxa"/>
-          </w:tblCellMar>
-        </w:tblPrEx>
         <w:tc>
           <w:tcPr>
             <w:tcW w:w="2891" w:type="dxa"/>
@@ -22888,12 +21521,6 @@
         </w:tc>
       </w:tr>
       <w:tr>
-        <w:tblPrEx>
-          <w:tblCellMar>
-            <w:top w:w="0" w:type="dxa"/>
-            <w:bottom w:w="0" w:type="dxa"/>
-          </w:tblCellMar>
-        </w:tblPrEx>
         <w:tc>
           <w:tcPr>
             <w:tcW w:w="2891" w:type="dxa"/>
@@ -22964,12 +21591,6 @@
         </w:tc>
       </w:tr>
       <w:tr>
-        <w:tblPrEx>
-          <w:tblCellMar>
-            <w:top w:w="0" w:type="dxa"/>
-            <w:bottom w:w="0" w:type="dxa"/>
-          </w:tblCellMar>
-        </w:tblPrEx>
         <w:tc>
           <w:tcPr>
             <w:tcW w:w="2891" w:type="dxa"/>
@@ -23040,12 +21661,6 @@
         </w:tc>
       </w:tr>
       <w:tr>
-        <w:tblPrEx>
-          <w:tblCellMar>
-            <w:top w:w="0" w:type="dxa"/>
-            <w:bottom w:w="0" w:type="dxa"/>
-          </w:tblCellMar>
-        </w:tblPrEx>
         <w:tc>
           <w:tcPr>
             <w:tcW w:w="2891" w:type="dxa"/>
@@ -23116,12 +21731,6 @@
         </w:tc>
       </w:tr>
       <w:tr>
-        <w:tblPrEx>
-          <w:tblCellMar>
-            <w:top w:w="0" w:type="dxa"/>
-            <w:bottom w:w="0" w:type="dxa"/>
-          </w:tblCellMar>
-        </w:tblPrEx>
         <w:tc>
           <w:tcPr>
             <w:tcW w:w="2891" w:type="dxa"/>
@@ -23192,12 +21801,6 @@
         </w:tc>
       </w:tr>
       <w:tr>
-        <w:tblPrEx>
-          <w:tblCellMar>
-            <w:top w:w="0" w:type="dxa"/>
-            <w:bottom w:w="0" w:type="dxa"/>
-          </w:tblCellMar>
-        </w:tblPrEx>
         <w:tc>
           <w:tcPr>
             <w:tcW w:w="2891" w:type="dxa"/>
@@ -23268,12 +21871,6 @@
         </w:tc>
       </w:tr>
       <w:tr>
-        <w:tblPrEx>
-          <w:tblCellMar>
-            <w:top w:w="0" w:type="dxa"/>
-            <w:bottom w:w="0" w:type="dxa"/>
-          </w:tblCellMar>
-        </w:tblPrEx>
         <w:tc>
           <w:tcPr>
             <w:tcW w:w="2891" w:type="dxa"/>
@@ -23344,12 +21941,6 @@
         </w:tc>
       </w:tr>
       <w:tr>
-        <w:tblPrEx>
-          <w:tblCellMar>
-            <w:top w:w="0" w:type="dxa"/>
-            <w:bottom w:w="0" w:type="dxa"/>
-          </w:tblCellMar>
-        </w:tblPrEx>
         <w:tc>
           <w:tcPr>
             <w:tcW w:w="2891" w:type="dxa"/>
@@ -23420,12 +22011,6 @@
         </w:tc>
       </w:tr>
       <w:tr>
-        <w:tblPrEx>
-          <w:tblCellMar>
-            <w:top w:w="0" w:type="dxa"/>
-            <w:bottom w:w="0" w:type="dxa"/>
-          </w:tblCellMar>
-        </w:tblPrEx>
         <w:tc>
           <w:tcPr>
             <w:tcW w:w="2891" w:type="dxa"/>
@@ -23555,6 +22140,17 @@
         <w:spacing w:before="100" w:after="80"/>
         <w:jc w:val="center"/>
         <w:rPr>
+          <w:noProof/>
+          <w:sz w:val="24"/>
+          <w:szCs w:val="24"/>
+        </w:rPr>
+      </w:pPr>
+    </w:p>
+    <w:p>
+      <w:pPr>
+        <w:spacing w:before="100" w:after="80"/>
+        <w:jc w:val="center"/>
+        <w:rPr>
           <w:sz w:val="24"/>
           <w:szCs w:val="24"/>
         </w:rPr>
@@ -23566,9 +22162,9 @@
           <w:szCs w:val="24"/>
         </w:rPr>
         <w:drawing>
-          <wp:inline distT="0" distB="0" distL="0" distR="0" wp14:anchorId="4EC8D0C2" wp14:editId="08FD90DA">
-            <wp:extent cx="4667250" cy="2009775"/>
-            <wp:effectExtent l="0" t="0" r="0" b="0"/>
+          <wp:inline distT="0" distB="0" distL="0" distR="0" wp14:anchorId="4EC8D0C2" wp14:editId="1FDF562F">
+            <wp:extent cx="2442210" cy="2009775"/>
+            <wp:effectExtent l="0" t="0" r="0" b="9525"/>
             <wp:docPr id="1550807933" name="image8.png" descr="image8.png" title="image8.png"/>
             <wp:cNvGraphicFramePr>
               <a:graphicFrameLocks xmlns:a="http://schemas.openxmlformats.org/drawingml/2006/main" noChangeAspect="1"/>
@@ -23582,9 +22178,9 @@
                       <a:picLocks noChangeAspect="1" noChangeArrowheads="1"/>
                     </pic:cNvPicPr>
                   </pic:nvPicPr>
-                  <pic:blipFill>
+                  <pic:blipFill rotWithShape="1">
                     <a:blip r:embed="rId15"/>
-                    <a:srcRect/>
+                    <a:srcRect l="47674"/>
                     <a:stretch>
                       <a:fillRect/>
                     </a:stretch>
@@ -23592,11 +22188,19 @@
                   <pic:spPr bwMode="auto">
                     <a:xfrm>
                       <a:off x="0" y="0"/>
-                      <a:ext cx="4667250" cy="2009775"/>
+                      <a:ext cx="2442210" cy="2009775"/>
                     </a:xfrm>
                     <a:prstGeom prst="rect">
                       <a:avLst/>
                     </a:prstGeom>
+                    <a:ln>
+                      <a:noFill/>
+                    </a:ln>
+                    <a:extLst>
+                      <a:ext uri="{53640926-AAD7-44D8-BBD7-CCE9431645EC}">
+                        <a14:shadowObscured xmlns:a14="http://schemas.microsoft.com/office/drawing/2010/main"/>
+                      </a:ext>
+                    </a:extLst>
                   </pic:spPr>
                 </pic:pic>
               </a:graphicData>
@@ -23692,12 +22296,6 @@
         <w:gridCol w:w="6747"/>
       </w:tblGrid>
       <w:tr>
-        <w:tblPrEx>
-          <w:tblCellMar>
-            <w:top w:w="0" w:type="dxa"/>
-            <w:bottom w:w="0" w:type="dxa"/>
-          </w:tblCellMar>
-        </w:tblPrEx>
         <w:tc>
           <w:tcPr>
             <w:tcW w:w="9638" w:type="dxa"/>
@@ -23737,12 +22335,6 @@
         </w:tc>
       </w:tr>
       <w:tr>
-        <w:tblPrEx>
-          <w:tblCellMar>
-            <w:top w:w="0" w:type="dxa"/>
-            <w:bottom w:w="0" w:type="dxa"/>
-          </w:tblCellMar>
-        </w:tblPrEx>
         <w:tc>
           <w:tcPr>
             <w:tcW w:w="2891" w:type="dxa"/>
@@ -23813,12 +22405,6 @@
         </w:tc>
       </w:tr>
       <w:tr>
-        <w:tblPrEx>
-          <w:tblCellMar>
-            <w:top w:w="0" w:type="dxa"/>
-            <w:bottom w:w="0" w:type="dxa"/>
-          </w:tblCellMar>
-        </w:tblPrEx>
         <w:tc>
           <w:tcPr>
             <w:tcW w:w="2891" w:type="dxa"/>
@@ -23889,12 +22475,6 @@
         </w:tc>
       </w:tr>
       <w:tr>
-        <w:tblPrEx>
-          <w:tblCellMar>
-            <w:top w:w="0" w:type="dxa"/>
-            <w:bottom w:w="0" w:type="dxa"/>
-          </w:tblCellMar>
-        </w:tblPrEx>
         <w:tc>
           <w:tcPr>
             <w:tcW w:w="2891" w:type="dxa"/>
@@ -23965,12 +22545,6 @@
         </w:tc>
       </w:tr>
       <w:tr>
-        <w:tblPrEx>
-          <w:tblCellMar>
-            <w:top w:w="0" w:type="dxa"/>
-            <w:bottom w:w="0" w:type="dxa"/>
-          </w:tblCellMar>
-        </w:tblPrEx>
         <w:tc>
           <w:tcPr>
             <w:tcW w:w="2891" w:type="dxa"/>
@@ -24041,12 +22615,6 @@
         </w:tc>
       </w:tr>
       <w:tr>
-        <w:tblPrEx>
-          <w:tblCellMar>
-            <w:top w:w="0" w:type="dxa"/>
-            <w:bottom w:w="0" w:type="dxa"/>
-          </w:tblCellMar>
-        </w:tblPrEx>
         <w:tc>
           <w:tcPr>
             <w:tcW w:w="2891" w:type="dxa"/>
@@ -24117,12 +22685,6 @@
         </w:tc>
       </w:tr>
       <w:tr>
-        <w:tblPrEx>
-          <w:tblCellMar>
-            <w:top w:w="0" w:type="dxa"/>
-            <w:bottom w:w="0" w:type="dxa"/>
-          </w:tblCellMar>
-        </w:tblPrEx>
         <w:tc>
           <w:tcPr>
             <w:tcW w:w="2891" w:type="dxa"/>
@@ -24193,12 +22755,6 @@
         </w:tc>
       </w:tr>
       <w:tr>
-        <w:tblPrEx>
-          <w:tblCellMar>
-            <w:top w:w="0" w:type="dxa"/>
-            <w:bottom w:w="0" w:type="dxa"/>
-          </w:tblCellMar>
-        </w:tblPrEx>
         <w:tc>
           <w:tcPr>
             <w:tcW w:w="2891" w:type="dxa"/>
@@ -24230,6 +22786,7 @@
                 <w:sz w:val="24"/>
                 <w:szCs w:val="24"/>
               </w:rPr>
+              <w:lastRenderedPageBreak/>
               <w:t>Postcondiciones</w:t>
             </w:r>
           </w:p>
@@ -24269,12 +22826,6 @@
         </w:tc>
       </w:tr>
       <w:tr>
-        <w:tblPrEx>
-          <w:tblCellMar>
-            <w:top w:w="0" w:type="dxa"/>
-            <w:bottom w:w="0" w:type="dxa"/>
-          </w:tblCellMar>
-        </w:tblPrEx>
         <w:tc>
           <w:tcPr>
             <w:tcW w:w="2891" w:type="dxa"/>
@@ -24306,7 +22857,6 @@
                 <w:sz w:val="24"/>
                 <w:szCs w:val="24"/>
               </w:rPr>
-              <w:lastRenderedPageBreak/>
               <w:t>Casos incluidos («include»)</w:t>
             </w:r>
           </w:p>
@@ -24346,12 +22896,6 @@
         </w:tc>
       </w:tr>
       <w:tr>
-        <w:tblPrEx>
-          <w:tblCellMar>
-            <w:top w:w="0" w:type="dxa"/>
-            <w:bottom w:w="0" w:type="dxa"/>
-          </w:tblCellMar>
-        </w:tblPrEx>
         <w:tc>
           <w:tcPr>
             <w:tcW w:w="2891" w:type="dxa"/>
@@ -24422,12 +22966,6 @@
         </w:tc>
       </w:tr>
       <w:tr>
-        <w:tblPrEx>
-          <w:tblCellMar>
-            <w:top w:w="0" w:type="dxa"/>
-            <w:bottom w:w="0" w:type="dxa"/>
-          </w:tblCellMar>
-        </w:tblPrEx>
         <w:tc>
           <w:tcPr>
             <w:tcW w:w="2891" w:type="dxa"/>
@@ -24498,12 +23036,6 @@
         </w:tc>
       </w:tr>
       <w:tr>
-        <w:tblPrEx>
-          <w:tblCellMar>
-            <w:top w:w="0" w:type="dxa"/>
-            <w:bottom w:w="0" w:type="dxa"/>
-          </w:tblCellMar>
-        </w:tblPrEx>
         <w:tc>
           <w:tcPr>
             <w:tcW w:w="2891" w:type="dxa"/>
@@ -24771,12 +23303,6 @@
         <w:gridCol w:w="6747"/>
       </w:tblGrid>
       <w:tr>
-        <w:tblPrEx>
-          <w:tblCellMar>
-            <w:top w:w="0" w:type="dxa"/>
-            <w:bottom w:w="0" w:type="dxa"/>
-          </w:tblCellMar>
-        </w:tblPrEx>
         <w:tc>
           <w:tcPr>
             <w:tcW w:w="9638" w:type="dxa"/>
@@ -24816,12 +23342,6 @@
         </w:tc>
       </w:tr>
       <w:tr>
-        <w:tblPrEx>
-          <w:tblCellMar>
-            <w:top w:w="0" w:type="dxa"/>
-            <w:bottom w:w="0" w:type="dxa"/>
-          </w:tblCellMar>
-        </w:tblPrEx>
         <w:tc>
           <w:tcPr>
             <w:tcW w:w="2891" w:type="dxa"/>
@@ -24892,12 +23412,6 @@
         </w:tc>
       </w:tr>
       <w:tr>
-        <w:tblPrEx>
-          <w:tblCellMar>
-            <w:top w:w="0" w:type="dxa"/>
-            <w:bottom w:w="0" w:type="dxa"/>
-          </w:tblCellMar>
-        </w:tblPrEx>
         <w:tc>
           <w:tcPr>
             <w:tcW w:w="2891" w:type="dxa"/>
@@ -24968,12 +23482,6 @@
         </w:tc>
       </w:tr>
       <w:tr>
-        <w:tblPrEx>
-          <w:tblCellMar>
-            <w:top w:w="0" w:type="dxa"/>
-            <w:bottom w:w="0" w:type="dxa"/>
-          </w:tblCellMar>
-        </w:tblPrEx>
         <w:tc>
           <w:tcPr>
             <w:tcW w:w="2891" w:type="dxa"/>
@@ -25044,12 +23552,6 @@
         </w:tc>
       </w:tr>
       <w:tr>
-        <w:tblPrEx>
-          <w:tblCellMar>
-            <w:top w:w="0" w:type="dxa"/>
-            <w:bottom w:w="0" w:type="dxa"/>
-          </w:tblCellMar>
-        </w:tblPrEx>
         <w:tc>
           <w:tcPr>
             <w:tcW w:w="2891" w:type="dxa"/>
@@ -25120,12 +23622,6 @@
         </w:tc>
       </w:tr>
       <w:tr>
-        <w:tblPrEx>
-          <w:tblCellMar>
-            <w:top w:w="0" w:type="dxa"/>
-            <w:bottom w:w="0" w:type="dxa"/>
-          </w:tblCellMar>
-        </w:tblPrEx>
         <w:tc>
           <w:tcPr>
             <w:tcW w:w="2891" w:type="dxa"/>
@@ -25196,12 +23692,6 @@
         </w:tc>
       </w:tr>
       <w:tr>
-        <w:tblPrEx>
-          <w:tblCellMar>
-            <w:top w:w="0" w:type="dxa"/>
-            <w:bottom w:w="0" w:type="dxa"/>
-          </w:tblCellMar>
-        </w:tblPrEx>
         <w:tc>
           <w:tcPr>
             <w:tcW w:w="2891" w:type="dxa"/>
@@ -25273,12 +23763,6 @@
         </w:tc>
       </w:tr>
       <w:tr>
-        <w:tblPrEx>
-          <w:tblCellMar>
-            <w:top w:w="0" w:type="dxa"/>
-            <w:bottom w:w="0" w:type="dxa"/>
-          </w:tblCellMar>
-        </w:tblPrEx>
         <w:tc>
           <w:tcPr>
             <w:tcW w:w="2891" w:type="dxa"/>
@@ -25349,12 +23833,6 @@
         </w:tc>
       </w:tr>
       <w:tr>
-        <w:tblPrEx>
-          <w:tblCellMar>
-            <w:top w:w="0" w:type="dxa"/>
-            <w:bottom w:w="0" w:type="dxa"/>
-          </w:tblCellMar>
-        </w:tblPrEx>
         <w:tc>
           <w:tcPr>
             <w:tcW w:w="2891" w:type="dxa"/>
@@ -25425,12 +23903,6 @@
         </w:tc>
       </w:tr>
       <w:tr>
-        <w:tblPrEx>
-          <w:tblCellMar>
-            <w:top w:w="0" w:type="dxa"/>
-            <w:bottom w:w="0" w:type="dxa"/>
-          </w:tblCellMar>
-        </w:tblPrEx>
         <w:tc>
           <w:tcPr>
             <w:tcW w:w="2891" w:type="dxa"/>
@@ -25501,12 +23973,6 @@
         </w:tc>
       </w:tr>
       <w:tr>
-        <w:tblPrEx>
-          <w:tblCellMar>
-            <w:top w:w="0" w:type="dxa"/>
-            <w:bottom w:w="0" w:type="dxa"/>
-          </w:tblCellMar>
-        </w:tblPrEx>
         <w:tc>
           <w:tcPr>
             <w:tcW w:w="2891" w:type="dxa"/>
@@ -25577,12 +24043,6 @@
         </w:tc>
       </w:tr>
       <w:tr>
-        <w:tblPrEx>
-          <w:tblCellMar>
-            <w:top w:w="0" w:type="dxa"/>
-            <w:bottom w:w="0" w:type="dxa"/>
-          </w:tblCellMar>
-        </w:tblPrEx>
         <w:tc>
           <w:tcPr>
             <w:tcW w:w="2891" w:type="dxa"/>
@@ -25850,12 +24310,6 @@
         <w:gridCol w:w="6747"/>
       </w:tblGrid>
       <w:tr>
-        <w:tblPrEx>
-          <w:tblCellMar>
-            <w:top w:w="0" w:type="dxa"/>
-            <w:bottom w:w="0" w:type="dxa"/>
-          </w:tblCellMar>
-        </w:tblPrEx>
         <w:tc>
           <w:tcPr>
             <w:tcW w:w="9638" w:type="dxa"/>
@@ -25895,12 +24349,6 @@
         </w:tc>
       </w:tr>
       <w:tr>
-        <w:tblPrEx>
-          <w:tblCellMar>
-            <w:top w:w="0" w:type="dxa"/>
-            <w:bottom w:w="0" w:type="dxa"/>
-          </w:tblCellMar>
-        </w:tblPrEx>
         <w:tc>
           <w:tcPr>
             <w:tcW w:w="2891" w:type="dxa"/>
@@ -25971,12 +24419,6 @@
         </w:tc>
       </w:tr>
       <w:tr>
-        <w:tblPrEx>
-          <w:tblCellMar>
-            <w:top w:w="0" w:type="dxa"/>
-            <w:bottom w:w="0" w:type="dxa"/>
-          </w:tblCellMar>
-        </w:tblPrEx>
         <w:tc>
           <w:tcPr>
             <w:tcW w:w="2891" w:type="dxa"/>
@@ -26047,12 +24489,6 @@
         </w:tc>
       </w:tr>
       <w:tr>
-        <w:tblPrEx>
-          <w:tblCellMar>
-            <w:top w:w="0" w:type="dxa"/>
-            <w:bottom w:w="0" w:type="dxa"/>
-          </w:tblCellMar>
-        </w:tblPrEx>
         <w:tc>
           <w:tcPr>
             <w:tcW w:w="2891" w:type="dxa"/>
@@ -26123,12 +24559,6 @@
         </w:tc>
       </w:tr>
       <w:tr>
-        <w:tblPrEx>
-          <w:tblCellMar>
-            <w:top w:w="0" w:type="dxa"/>
-            <w:bottom w:w="0" w:type="dxa"/>
-          </w:tblCellMar>
-        </w:tblPrEx>
         <w:tc>
           <w:tcPr>
             <w:tcW w:w="2891" w:type="dxa"/>
@@ -26199,12 +24629,6 @@
         </w:tc>
       </w:tr>
       <w:tr>
-        <w:tblPrEx>
-          <w:tblCellMar>
-            <w:top w:w="0" w:type="dxa"/>
-            <w:bottom w:w="0" w:type="dxa"/>
-          </w:tblCellMar>
-        </w:tblPrEx>
         <w:tc>
           <w:tcPr>
             <w:tcW w:w="2891" w:type="dxa"/>
@@ -26275,12 +24699,6 @@
         </w:tc>
       </w:tr>
       <w:tr>
-        <w:tblPrEx>
-          <w:tblCellMar>
-            <w:top w:w="0" w:type="dxa"/>
-            <w:bottom w:w="0" w:type="dxa"/>
-          </w:tblCellMar>
-        </w:tblPrEx>
         <w:tc>
           <w:tcPr>
             <w:tcW w:w="2891" w:type="dxa"/>
@@ -26351,12 +24769,6 @@
         </w:tc>
       </w:tr>
       <w:tr>
-        <w:tblPrEx>
-          <w:tblCellMar>
-            <w:top w:w="0" w:type="dxa"/>
-            <w:bottom w:w="0" w:type="dxa"/>
-          </w:tblCellMar>
-        </w:tblPrEx>
         <w:tc>
           <w:tcPr>
             <w:tcW w:w="2891" w:type="dxa"/>
@@ -26428,12 +24840,6 @@
         </w:tc>
       </w:tr>
       <w:tr>
-        <w:tblPrEx>
-          <w:tblCellMar>
-            <w:top w:w="0" w:type="dxa"/>
-            <w:bottom w:w="0" w:type="dxa"/>
-          </w:tblCellMar>
-        </w:tblPrEx>
         <w:tc>
           <w:tcPr>
             <w:tcW w:w="2891" w:type="dxa"/>
@@ -26504,12 +24910,6 @@
         </w:tc>
       </w:tr>
       <w:tr>
-        <w:tblPrEx>
-          <w:tblCellMar>
-            <w:top w:w="0" w:type="dxa"/>
-            <w:bottom w:w="0" w:type="dxa"/>
-          </w:tblCellMar>
-        </w:tblPrEx>
         <w:tc>
           <w:tcPr>
             <w:tcW w:w="2891" w:type="dxa"/>
@@ -26580,12 +24980,6 @@
         </w:tc>
       </w:tr>
       <w:tr>
-        <w:tblPrEx>
-          <w:tblCellMar>
-            <w:top w:w="0" w:type="dxa"/>
-            <w:bottom w:w="0" w:type="dxa"/>
-          </w:tblCellMar>
-        </w:tblPrEx>
         <w:tc>
           <w:tcPr>
             <w:tcW w:w="2891" w:type="dxa"/>
@@ -26656,12 +25050,6 @@
         </w:tc>
       </w:tr>
       <w:tr>
-        <w:tblPrEx>
-          <w:tblCellMar>
-            <w:top w:w="0" w:type="dxa"/>
-            <w:bottom w:w="0" w:type="dxa"/>
-          </w:tblCellMar>
-        </w:tblPrEx>
         <w:tc>
           <w:tcPr>
             <w:tcW w:w="2891" w:type="dxa"/>
@@ -26932,34 +25320,7 @@
         <w:sz w:val="18"/>
         <w:szCs w:val="18"/>
       </w:rPr>
-      <w:t xml:space="preserve">            </w:t>
-    </w:r>
-    <w:r>
-      <w:rPr>
-        <w:b/>
-        <w:bCs/>
-        <w:sz w:val="18"/>
-        <w:szCs w:val="18"/>
-      </w:rPr>
-      <w:t xml:space="preserve">   </w:t>
-    </w:r>
-    <w:r>
-      <w:rPr>
-        <w:b/>
-        <w:bCs/>
-        <w:sz w:val="18"/>
-        <w:szCs w:val="18"/>
-      </w:rPr>
-      <w:t xml:space="preserve">                </w:t>
-    </w:r>
-    <w:r>
-      <w:rPr>
-        <w:b/>
-        <w:bCs/>
-        <w:sz w:val="18"/>
-        <w:szCs w:val="18"/>
-      </w:rPr>
-      <w:t>— Diagramas de Casos de Uso (UML)</w:t>
+      <w:t xml:space="preserve">                               — Diagramas de Casos de Uso (UML)</w:t>
     </w:r>
     <w:r>
       <w:rPr>

</xml_diff>